<commit_message>
improved report and presentation
</commit_message>
<xml_diff>
--- a/Task7/Отчёт_по_7_лабе_реверс_инжиниринг.docx
+++ b/Task7/Отчёт_по_7_лабе_реверс_инжиниринг.docx
@@ -2061,25 +2061,7 @@
             <w:sz w:val="28"/>
             <w:szCs w:val="28"/>
           </w:rPr>
-          <w:t>GitHub Ana</w:t>
-        </w:r>
-        <w:r>
-          <w:rPr>
-            <w:rStyle w:val="a7"/>
-            <w:rFonts w:ascii="Times New Roman" w:hAnsi="Times New Roman" w:cs="Times New Roman"/>
-            <w:sz w:val="28"/>
-            <w:szCs w:val="28"/>
-          </w:rPr>
-          <w:t>l</w:t>
-        </w:r>
-        <w:r>
-          <w:rPr>
-            <w:rStyle w:val="a7"/>
-            <w:rFonts w:ascii="Times New Roman" w:hAnsi="Times New Roman" w:cs="Times New Roman"/>
-            <w:sz w:val="28"/>
-            <w:szCs w:val="28"/>
-          </w:rPr>
-          <w:t>yzer</w:t>
+          <w:t>GitHub Analyzer</w:t>
         </w:r>
       </w:hyperlink>
       <w:r>
@@ -2156,15 +2138,7 @@
           <w:sz w:val="28"/>
           <w:szCs w:val="28"/>
         </w:rPr>
-        <w:t xml:space="preserve"> </w:t>
-      </w:r>
-      <w:r>
-        <w:rPr>
-          <w:rFonts w:ascii="Times New Roman" w:hAnsi="Times New Roman" w:cs="Times New Roman"/>
-          <w:sz w:val="28"/>
-          <w:szCs w:val="28"/>
-        </w:rPr>
-        <w:t>(</w:t>
+        <w:t xml:space="preserve"> (</w:t>
       </w:r>
       <w:r>
         <w:rPr>
@@ -2213,17 +2187,7 @@
           <w:sz w:val="28"/>
           <w:szCs w:val="28"/>
         </w:rPr>
-        <w:t>Рисунок</w:t>
-      </w:r>
-      <w:r>
-        <w:rPr>
-          <w:i/>
-          <w:iCs/>
-          <w:color w:val="000000" w:themeColor="text1"/>
-          <w:sz w:val="28"/>
-          <w:szCs w:val="28"/>
-        </w:rPr>
-        <w:t xml:space="preserve"> </w:t>
+        <w:t xml:space="preserve">Рисунок </w:t>
       </w:r>
       <w:r>
         <w:rPr>
@@ -2270,6 +2234,7 @@
       <w:r>
         <w:rPr>
           <w:rFonts w:ascii="Times New Roman" w:hAnsi="Times New Roman" w:cs="Times New Roman"/>
+          <w:noProof/>
           <w:sz w:val="28"/>
           <w:szCs w:val="28"/>
         </w:rPr>
@@ -2475,27 +2440,7 @@
           <w:sz w:val="28"/>
           <w:szCs w:val="28"/>
         </w:rPr>
-        <w:t>Рис</w:t>
-      </w:r>
-      <w:r>
-        <w:rPr>
-          <w:i/>
-          <w:iCs/>
-          <w:color w:val="000000" w:themeColor="text1"/>
-          <w:sz w:val="28"/>
-          <w:szCs w:val="28"/>
-        </w:rPr>
-        <w:t>у</w:t>
-      </w:r>
-      <w:r>
-        <w:rPr>
-          <w:i/>
-          <w:iCs/>
-          <w:color w:val="000000" w:themeColor="text1"/>
-          <w:sz w:val="28"/>
-          <w:szCs w:val="28"/>
-        </w:rPr>
-        <w:t>нок 2</w:t>
+        <w:t>Рисунок 2</w:t>
       </w:r>
       <w:r>
         <w:rPr>
@@ -2831,27 +2776,7 @@
           <w:sz w:val="28"/>
           <w:szCs w:val="28"/>
         </w:rPr>
-        <w:t>Рисун</w:t>
-      </w:r>
-      <w:r>
-        <w:rPr>
-          <w:i/>
-          <w:iCs/>
-          <w:color w:val="000000" w:themeColor="text1"/>
-          <w:sz w:val="28"/>
-          <w:szCs w:val="28"/>
-        </w:rPr>
-        <w:t>о</w:t>
-      </w:r>
-      <w:r>
-        <w:rPr>
-          <w:i/>
-          <w:iCs/>
-          <w:color w:val="000000" w:themeColor="text1"/>
-          <w:sz w:val="28"/>
-          <w:szCs w:val="28"/>
-        </w:rPr>
-        <w:t>к 4</w:t>
+        <w:t>Рисунок 4</w:t>
       </w:r>
       <w:r>
         <w:rPr>
@@ -2887,6 +2812,7 @@
       <w:r>
         <w:rPr>
           <w:rFonts w:ascii="Times New Roman" w:hAnsi="Times New Roman" w:cs="Times New Roman"/>
+          <w:noProof/>
           <w:sz w:val="28"/>
           <w:szCs w:val="28"/>
         </w:rPr>
@@ -3033,6 +2959,7 @@
       <w:r>
         <w:rPr>
           <w:rFonts w:ascii="Times New Roman" w:hAnsi="Times New Roman" w:cs="Times New Roman"/>
+          <w:noProof/>
           <w:sz w:val="28"/>
           <w:szCs w:val="28"/>
         </w:rPr>
@@ -3364,6 +3291,7 @@
       <w:r>
         <w:rPr>
           <w:rFonts w:ascii="Times New Roman" w:hAnsi="Times New Roman" w:cs="Times New Roman"/>
+          <w:noProof/>
           <w:sz w:val="28"/>
           <w:szCs w:val="28"/>
         </w:rPr>
@@ -3502,6 +3430,9 @@
         <w:keepNext/>
       </w:pPr>
       <w:r>
+        <w:rPr>
+          <w:noProof/>
+        </w:rPr>
         <w:drawing>
           <wp:inline distT="0" distB="0" distL="0" distR="0" wp14:anchorId="48BF829A" wp14:editId="6B8EF6E9">
             <wp:extent cx="5940425" cy="2331720"/>
@@ -3757,7 +3688,15 @@
           <w:szCs w:val="28"/>
         </w:rPr>
         <w:lastRenderedPageBreak/>
-        <w:t>Завершающими этапами стали выполнение команд npx prisma generate и npx prisma migrate dev --name init, после чего приложение было успешно запущено командой npm run dev</w:t>
+        <w:t>Следующими</w:t>
+      </w:r>
+      <w:r>
+        <w:rPr>
+          <w:rFonts w:ascii="Times New Roman" w:hAnsi="Times New Roman" w:cs="Times New Roman"/>
+          <w:sz w:val="28"/>
+          <w:szCs w:val="28"/>
+        </w:rPr>
+        <w:t xml:space="preserve"> этапами стали выполнение команд npx prisma generate и npx prisma migrate dev --name init, после чего приложение было успешно запущено командой npm run dev</w:t>
       </w:r>
       <w:r>
         <w:rPr>
@@ -4001,6 +3940,7 @@
       <w:r>
         <w:rPr>
           <w:rFonts w:ascii="Times New Roman" w:hAnsi="Times New Roman" w:cs="Times New Roman"/>
+          <w:noProof/>
           <w:sz w:val="28"/>
           <w:szCs w:val="28"/>
           <w:lang w:val="en-US"/>
@@ -4140,17 +4080,7 @@
           <w:sz w:val="28"/>
           <w:szCs w:val="28"/>
         </w:rPr>
-        <w:t xml:space="preserve"> - </w:t>
-      </w:r>
-      <w:r>
-        <w:rPr>
-          <w:i w:val="0"/>
-          <w:iCs w:val="0"/>
-          <w:color w:val="000000" w:themeColor="text1"/>
-          <w:sz w:val="28"/>
-          <w:szCs w:val="28"/>
-        </w:rPr>
-        <w:t>Автоматическая генерация кода для работы с базой данных (Prisma Client)</w:t>
+        <w:t xml:space="preserve"> - Автоматическая генерация кода для работы с базой данных (Prisma Client)</w:t>
       </w:r>
     </w:p>
     <w:p>
@@ -4162,6 +4092,7 @@
       <w:r>
         <w:rPr>
           <w:rFonts w:ascii="Times New Roman" w:hAnsi="Times New Roman" w:cs="Times New Roman"/>
+          <w:noProof/>
           <w:sz w:val="28"/>
           <w:szCs w:val="28"/>
         </w:rPr>
@@ -4317,6 +4248,7 @@
       <w:r>
         <w:rPr>
           <w:rFonts w:ascii="Times New Roman" w:hAnsi="Times New Roman" w:cs="Times New Roman"/>
+          <w:noProof/>
           <w:sz w:val="28"/>
           <w:szCs w:val="28"/>
         </w:rPr>
@@ -4444,6 +4376,2566 @@
         <w:t xml:space="preserve"> - Запуск локального сервера разработки</w:t>
       </w:r>
     </w:p>
+    <w:p/>
+    <w:p>
+      <w:pPr>
+        <w:spacing w:after="0" w:line="360" w:lineRule="auto"/>
+        <w:ind w:firstLine="709"/>
+        <w:jc w:val="both"/>
+        <w:rPr>
+          <w:rFonts w:ascii="Times New Roman" w:hAnsi="Times New Roman" w:cs="Times New Roman"/>
+          <w:sz w:val="28"/>
+          <w:szCs w:val="28"/>
+        </w:rPr>
+      </w:pPr>
+      <w:r>
+        <w:rPr>
+          <w:rFonts w:ascii="Times New Roman" w:hAnsi="Times New Roman" w:cs="Times New Roman"/>
+          <w:sz w:val="28"/>
+          <w:szCs w:val="28"/>
+        </w:rPr>
+        <w:t>В ходе изучения исходного кода инструмента было обнаружено, что кнопка «</w:t>
+      </w:r>
+      <w:proofErr w:type="spellStart"/>
+      <w:r>
+        <w:rPr>
+          <w:rFonts w:ascii="Times New Roman" w:hAnsi="Times New Roman" w:cs="Times New Roman"/>
+          <w:sz w:val="28"/>
+          <w:szCs w:val="28"/>
+        </w:rPr>
+        <w:t>Analyze</w:t>
+      </w:r>
+      <w:proofErr w:type="spellEnd"/>
+      <w:r>
+        <w:rPr>
+          <w:rFonts w:ascii="Times New Roman" w:hAnsi="Times New Roman" w:cs="Times New Roman"/>
+          <w:sz w:val="28"/>
+          <w:szCs w:val="28"/>
+        </w:rPr>
+        <w:t xml:space="preserve">» не выполняет реальных запросов к </w:t>
+      </w:r>
+      <w:proofErr w:type="spellStart"/>
+      <w:r>
+        <w:rPr>
+          <w:rFonts w:ascii="Times New Roman" w:hAnsi="Times New Roman" w:cs="Times New Roman"/>
+          <w:sz w:val="28"/>
+          <w:szCs w:val="28"/>
+        </w:rPr>
+        <w:t>GitHub</w:t>
+      </w:r>
+      <w:proofErr w:type="spellEnd"/>
+      <w:r>
+        <w:rPr>
+          <w:rFonts w:ascii="Times New Roman" w:hAnsi="Times New Roman" w:cs="Times New Roman"/>
+          <w:sz w:val="28"/>
+          <w:szCs w:val="28"/>
+        </w:rPr>
+        <w:t xml:space="preserve"> API, а лишь имитирует прогресс-бар. Данные в карточке на главной странице являются статичными заглушками, </w:t>
+      </w:r>
+      <w:proofErr w:type="spellStart"/>
+      <w:r>
+        <w:rPr>
+          <w:rFonts w:ascii="Times New Roman" w:hAnsi="Times New Roman" w:cs="Times New Roman"/>
+          <w:sz w:val="28"/>
+          <w:szCs w:val="28"/>
+        </w:rPr>
+        <w:t>захардкоженными</w:t>
+      </w:r>
+      <w:proofErr w:type="spellEnd"/>
+      <w:r>
+        <w:rPr>
+          <w:rFonts w:ascii="Times New Roman" w:hAnsi="Times New Roman" w:cs="Times New Roman"/>
+          <w:sz w:val="28"/>
+          <w:szCs w:val="28"/>
+        </w:rPr>
+        <w:t xml:space="preserve"> в компоненте </w:t>
+      </w:r>
+      <w:proofErr w:type="spellStart"/>
+      <w:r>
+        <w:rPr>
+          <w:rFonts w:ascii="Times New Roman" w:hAnsi="Times New Roman" w:cs="Times New Roman"/>
+          <w:sz w:val="28"/>
+          <w:szCs w:val="28"/>
+        </w:rPr>
+        <w:t>hero.tsx</w:t>
+      </w:r>
+      <w:proofErr w:type="spellEnd"/>
+      <w:r>
+        <w:rPr>
+          <w:rFonts w:ascii="Times New Roman" w:hAnsi="Times New Roman" w:cs="Times New Roman"/>
+          <w:sz w:val="28"/>
+          <w:szCs w:val="28"/>
+        </w:rPr>
+        <w:t xml:space="preserve">. Для устранения этого недостатка была проведена доработка исходного кода: создан API-маршрут, осуществляющий реальные запросы к </w:t>
+      </w:r>
+      <w:proofErr w:type="spellStart"/>
+      <w:r>
+        <w:rPr>
+          <w:rFonts w:ascii="Times New Roman" w:hAnsi="Times New Roman" w:cs="Times New Roman"/>
+          <w:sz w:val="28"/>
+          <w:szCs w:val="28"/>
+        </w:rPr>
+        <w:t>GitHub</w:t>
+      </w:r>
+      <w:proofErr w:type="spellEnd"/>
+      <w:r>
+        <w:rPr>
+          <w:rFonts w:ascii="Times New Roman" w:hAnsi="Times New Roman" w:cs="Times New Roman"/>
+          <w:sz w:val="28"/>
+          <w:szCs w:val="28"/>
+        </w:rPr>
+        <w:t xml:space="preserve"> REST API, и обновлён компонент </w:t>
+      </w:r>
+      <w:proofErr w:type="spellStart"/>
+      <w:r>
+        <w:rPr>
+          <w:rFonts w:ascii="Times New Roman" w:hAnsi="Times New Roman" w:cs="Times New Roman"/>
+          <w:sz w:val="28"/>
+          <w:szCs w:val="28"/>
+        </w:rPr>
+        <w:t>hero.tsx</w:t>
+      </w:r>
+      <w:proofErr w:type="spellEnd"/>
+      <w:r>
+        <w:rPr>
+          <w:rFonts w:ascii="Times New Roman" w:hAnsi="Times New Roman" w:cs="Times New Roman"/>
+          <w:sz w:val="28"/>
+          <w:szCs w:val="28"/>
+        </w:rPr>
+        <w:t xml:space="preserve"> для отображения полученных данных.</w:t>
+      </w:r>
+    </w:p>
+    <w:p>
+      <w:pPr>
+        <w:spacing w:before="120" w:after="60" w:line="360" w:lineRule="auto"/>
+        <w:ind w:firstLine="709"/>
+        <w:jc w:val="both"/>
+        <w:rPr>
+          <w:rFonts w:ascii="Times New Roman" w:hAnsi="Times New Roman" w:cs="Times New Roman"/>
+          <w:b/>
+          <w:bCs/>
+          <w:sz w:val="28"/>
+          <w:szCs w:val="28"/>
+        </w:rPr>
+      </w:pPr>
+      <w:r>
+        <w:rPr>
+          <w:rFonts w:ascii="Times New Roman" w:hAnsi="Times New Roman" w:cs="Times New Roman"/>
+          <w:b/>
+          <w:bCs/>
+          <w:sz w:val="28"/>
+          <w:szCs w:val="28"/>
+        </w:rPr>
+        <w:t>Шаг 1. Создание структуры папок для API-маршрута</w:t>
+      </w:r>
+    </w:p>
+    <w:p>
+      <w:pPr>
+        <w:spacing w:after="0" w:line="360" w:lineRule="auto"/>
+        <w:ind w:firstLine="709"/>
+        <w:jc w:val="both"/>
+        <w:rPr>
+          <w:rFonts w:ascii="Times New Roman" w:hAnsi="Times New Roman" w:cs="Times New Roman"/>
+          <w:sz w:val="28"/>
+          <w:szCs w:val="28"/>
+        </w:rPr>
+      </w:pPr>
+      <w:r>
+        <w:rPr>
+          <w:rFonts w:ascii="Times New Roman" w:hAnsi="Times New Roman" w:cs="Times New Roman"/>
+          <w:sz w:val="28"/>
+          <w:szCs w:val="28"/>
+        </w:rPr>
+        <w:t>В Next.js 15 (</w:t>
+      </w:r>
+      <w:proofErr w:type="spellStart"/>
+      <w:r>
+        <w:rPr>
+          <w:rFonts w:ascii="Times New Roman" w:hAnsi="Times New Roman" w:cs="Times New Roman"/>
+          <w:sz w:val="28"/>
+          <w:szCs w:val="28"/>
+        </w:rPr>
+        <w:t>App</w:t>
+      </w:r>
+      <w:proofErr w:type="spellEnd"/>
+      <w:r>
+        <w:rPr>
+          <w:rFonts w:ascii="Times New Roman" w:hAnsi="Times New Roman" w:cs="Times New Roman"/>
+          <w:sz w:val="28"/>
+          <w:szCs w:val="28"/>
+        </w:rPr>
+        <w:t xml:space="preserve"> </w:t>
+      </w:r>
+      <w:proofErr w:type="spellStart"/>
+      <w:r>
+        <w:rPr>
+          <w:rFonts w:ascii="Times New Roman" w:hAnsi="Times New Roman" w:cs="Times New Roman"/>
+          <w:sz w:val="28"/>
+          <w:szCs w:val="28"/>
+        </w:rPr>
+        <w:t>Router</w:t>
+      </w:r>
+      <w:proofErr w:type="spellEnd"/>
+      <w:r>
+        <w:rPr>
+          <w:rFonts w:ascii="Times New Roman" w:hAnsi="Times New Roman" w:cs="Times New Roman"/>
+          <w:sz w:val="28"/>
+          <w:szCs w:val="28"/>
+        </w:rPr>
+        <w:t xml:space="preserve">) API-маршруты размещаются в директории </w:t>
+      </w:r>
+      <w:proofErr w:type="spellStart"/>
+      <w:r>
+        <w:rPr>
+          <w:rFonts w:ascii="Times New Roman" w:hAnsi="Times New Roman" w:cs="Times New Roman"/>
+          <w:sz w:val="28"/>
+          <w:szCs w:val="28"/>
+        </w:rPr>
+        <w:t>src</w:t>
+      </w:r>
+      <w:proofErr w:type="spellEnd"/>
+      <w:r>
+        <w:rPr>
+          <w:rFonts w:ascii="Times New Roman" w:hAnsi="Times New Roman" w:cs="Times New Roman"/>
+          <w:sz w:val="28"/>
+          <w:szCs w:val="28"/>
+        </w:rPr>
+        <w:t>/</w:t>
+      </w:r>
+      <w:proofErr w:type="spellStart"/>
+      <w:r>
+        <w:rPr>
+          <w:rFonts w:ascii="Times New Roman" w:hAnsi="Times New Roman" w:cs="Times New Roman"/>
+          <w:sz w:val="28"/>
+          <w:szCs w:val="28"/>
+        </w:rPr>
+        <w:t>app</w:t>
+      </w:r>
+      <w:proofErr w:type="spellEnd"/>
+      <w:r>
+        <w:rPr>
+          <w:rFonts w:ascii="Times New Roman" w:hAnsi="Times New Roman" w:cs="Times New Roman"/>
+          <w:sz w:val="28"/>
+          <w:szCs w:val="28"/>
+        </w:rPr>
+        <w:t>/</w:t>
+      </w:r>
+      <w:proofErr w:type="spellStart"/>
+      <w:r>
+        <w:rPr>
+          <w:rFonts w:ascii="Times New Roman" w:hAnsi="Times New Roman" w:cs="Times New Roman"/>
+          <w:sz w:val="28"/>
+          <w:szCs w:val="28"/>
+        </w:rPr>
+        <w:t>api</w:t>
+      </w:r>
+      <w:proofErr w:type="spellEnd"/>
+      <w:r>
+        <w:rPr>
+          <w:rFonts w:ascii="Times New Roman" w:hAnsi="Times New Roman" w:cs="Times New Roman"/>
+          <w:sz w:val="28"/>
+          <w:szCs w:val="28"/>
+        </w:rPr>
+        <w:t>/. Поскольку данная папка отсутствовала в репозитории, она была создана вручную:</w:t>
+      </w:r>
+    </w:p>
+    <w:p>
+      <w:pPr>
+        <w:spacing w:before="60" w:after="60" w:line="280" w:lineRule="auto"/>
+        <w:ind w:left="720"/>
+        <w:rPr>
+          <w:rFonts w:ascii="Courier New" w:hAnsi="Courier New" w:cs="Courier New"/>
+          <w:sz w:val="20"/>
+          <w:szCs w:val="20"/>
+          <w:lang w:val="en-US"/>
+        </w:rPr>
+      </w:pPr>
+      <w:proofErr w:type="spellStart"/>
+      <w:r>
+        <w:rPr>
+          <w:rFonts w:ascii="Courier New" w:hAnsi="Courier New" w:cs="Courier New"/>
+          <w:sz w:val="20"/>
+          <w:szCs w:val="20"/>
+          <w:lang w:val="en-US"/>
+        </w:rPr>
+        <w:t>mkdir</w:t>
+      </w:r>
+      <w:proofErr w:type="spellEnd"/>
+      <w:r>
+        <w:rPr>
+          <w:rFonts w:ascii="Courier New" w:hAnsi="Courier New" w:cs="Courier New"/>
+          <w:sz w:val="20"/>
+          <w:szCs w:val="20"/>
+          <w:lang w:val="en-US"/>
+        </w:rPr>
+        <w:t xml:space="preserve"> </w:t>
+      </w:r>
+      <w:proofErr w:type="spellStart"/>
+      <w:r>
+        <w:rPr>
+          <w:rFonts w:ascii="Courier New" w:hAnsi="Courier New" w:cs="Courier New"/>
+          <w:sz w:val="20"/>
+          <w:szCs w:val="20"/>
+          <w:lang w:val="en-US"/>
+        </w:rPr>
+        <w:t>src</w:t>
+      </w:r>
+      <w:proofErr w:type="spellEnd"/>
+      <w:r>
+        <w:rPr>
+          <w:rFonts w:ascii="Courier New" w:hAnsi="Courier New" w:cs="Courier New"/>
+          <w:sz w:val="20"/>
+          <w:szCs w:val="20"/>
+          <w:lang w:val="en-US"/>
+        </w:rPr>
+        <w:t>\app\</w:t>
+      </w:r>
+      <w:proofErr w:type="spellStart"/>
+      <w:r>
+        <w:rPr>
+          <w:rFonts w:ascii="Courier New" w:hAnsi="Courier New" w:cs="Courier New"/>
+          <w:sz w:val="20"/>
+          <w:szCs w:val="20"/>
+          <w:lang w:val="en-US"/>
+        </w:rPr>
+        <w:t>api</w:t>
+      </w:r>
+      <w:proofErr w:type="spellEnd"/>
+    </w:p>
+    <w:p>
+      <w:pPr>
+        <w:spacing w:before="60" w:after="60" w:line="280" w:lineRule="auto"/>
+        <w:ind w:left="720"/>
+        <w:rPr>
+          <w:rFonts w:ascii="Courier New" w:hAnsi="Courier New" w:cs="Courier New"/>
+          <w:sz w:val="20"/>
+          <w:szCs w:val="20"/>
+          <w:lang w:val="en-US"/>
+        </w:rPr>
+      </w:pPr>
+      <w:proofErr w:type="spellStart"/>
+      <w:r>
+        <w:rPr>
+          <w:rFonts w:ascii="Courier New" w:hAnsi="Courier New" w:cs="Courier New"/>
+          <w:sz w:val="20"/>
+          <w:szCs w:val="20"/>
+          <w:lang w:val="en-US"/>
+        </w:rPr>
+        <w:t>mkdir</w:t>
+      </w:r>
+      <w:proofErr w:type="spellEnd"/>
+      <w:r>
+        <w:rPr>
+          <w:rFonts w:ascii="Courier New" w:hAnsi="Courier New" w:cs="Courier New"/>
+          <w:sz w:val="20"/>
+          <w:szCs w:val="20"/>
+          <w:lang w:val="en-US"/>
+        </w:rPr>
+        <w:t xml:space="preserve"> </w:t>
+      </w:r>
+      <w:proofErr w:type="spellStart"/>
+      <w:r>
+        <w:rPr>
+          <w:rFonts w:ascii="Courier New" w:hAnsi="Courier New" w:cs="Courier New"/>
+          <w:sz w:val="20"/>
+          <w:szCs w:val="20"/>
+          <w:lang w:val="en-US"/>
+        </w:rPr>
+        <w:t>src</w:t>
+      </w:r>
+      <w:proofErr w:type="spellEnd"/>
+      <w:r>
+        <w:rPr>
+          <w:rFonts w:ascii="Courier New" w:hAnsi="Courier New" w:cs="Courier New"/>
+          <w:sz w:val="20"/>
+          <w:szCs w:val="20"/>
+          <w:lang w:val="en-US"/>
+        </w:rPr>
+        <w:t>\app\</w:t>
+      </w:r>
+      <w:proofErr w:type="spellStart"/>
+      <w:r>
+        <w:rPr>
+          <w:rFonts w:ascii="Courier New" w:hAnsi="Courier New" w:cs="Courier New"/>
+          <w:sz w:val="20"/>
+          <w:szCs w:val="20"/>
+          <w:lang w:val="en-US"/>
+        </w:rPr>
+        <w:t>api</w:t>
+      </w:r>
+      <w:proofErr w:type="spellEnd"/>
+      <w:r>
+        <w:rPr>
+          <w:rFonts w:ascii="Courier New" w:hAnsi="Courier New" w:cs="Courier New"/>
+          <w:sz w:val="20"/>
+          <w:szCs w:val="20"/>
+          <w:lang w:val="en-US"/>
+        </w:rPr>
+        <w:t>\analyze</w:t>
+      </w:r>
+    </w:p>
+    <w:p>
+      <w:pPr>
+        <w:spacing w:before="120" w:after="60" w:line="360" w:lineRule="auto"/>
+        <w:ind w:firstLine="709"/>
+        <w:jc w:val="both"/>
+        <w:rPr>
+          <w:rFonts w:ascii="Times New Roman" w:hAnsi="Times New Roman" w:cs="Times New Roman"/>
+          <w:b/>
+          <w:bCs/>
+          <w:sz w:val="28"/>
+          <w:szCs w:val="28"/>
+        </w:rPr>
+      </w:pPr>
+      <w:r>
+        <w:rPr>
+          <w:rFonts w:ascii="Times New Roman" w:hAnsi="Times New Roman" w:cs="Times New Roman"/>
+          <w:b/>
+          <w:bCs/>
+          <w:sz w:val="28"/>
+          <w:szCs w:val="28"/>
+        </w:rPr>
+        <w:t xml:space="preserve">Шаг 2. Создание файла API-маршрута </w:t>
+      </w:r>
+      <w:proofErr w:type="spellStart"/>
+      <w:r>
+        <w:rPr>
+          <w:rFonts w:ascii="Times New Roman" w:hAnsi="Times New Roman" w:cs="Times New Roman"/>
+          <w:b/>
+          <w:bCs/>
+          <w:sz w:val="28"/>
+          <w:szCs w:val="28"/>
+        </w:rPr>
+        <w:t>route.ts</w:t>
+      </w:r>
+      <w:proofErr w:type="spellEnd"/>
+    </w:p>
+    <w:p>
+      <w:pPr>
+        <w:spacing w:after="0" w:line="360" w:lineRule="auto"/>
+        <w:ind w:firstLine="709"/>
+        <w:jc w:val="both"/>
+        <w:rPr>
+          <w:rFonts w:ascii="Times New Roman" w:hAnsi="Times New Roman" w:cs="Times New Roman"/>
+          <w:sz w:val="28"/>
+          <w:szCs w:val="28"/>
+        </w:rPr>
+      </w:pPr>
+      <w:r>
+        <w:rPr>
+          <w:rFonts w:ascii="Times New Roman" w:hAnsi="Times New Roman" w:cs="Times New Roman"/>
+          <w:sz w:val="28"/>
+          <w:szCs w:val="28"/>
+        </w:rPr>
+        <w:t xml:space="preserve">В папке </w:t>
+      </w:r>
+      <w:proofErr w:type="spellStart"/>
+      <w:r>
+        <w:rPr>
+          <w:rFonts w:ascii="Times New Roman" w:hAnsi="Times New Roman" w:cs="Times New Roman"/>
+          <w:sz w:val="28"/>
+          <w:szCs w:val="28"/>
+        </w:rPr>
+        <w:t>src</w:t>
+      </w:r>
+      <w:proofErr w:type="spellEnd"/>
+      <w:r>
+        <w:rPr>
+          <w:rFonts w:ascii="Times New Roman" w:hAnsi="Times New Roman" w:cs="Times New Roman"/>
+          <w:sz w:val="28"/>
+          <w:szCs w:val="28"/>
+        </w:rPr>
+        <w:t>\</w:t>
+      </w:r>
+      <w:proofErr w:type="spellStart"/>
+      <w:r>
+        <w:rPr>
+          <w:rFonts w:ascii="Times New Roman" w:hAnsi="Times New Roman" w:cs="Times New Roman"/>
+          <w:sz w:val="28"/>
+          <w:szCs w:val="28"/>
+        </w:rPr>
+        <w:t>app</w:t>
+      </w:r>
+      <w:proofErr w:type="spellEnd"/>
+      <w:r>
+        <w:rPr>
+          <w:rFonts w:ascii="Times New Roman" w:hAnsi="Times New Roman" w:cs="Times New Roman"/>
+          <w:sz w:val="28"/>
+          <w:szCs w:val="28"/>
+        </w:rPr>
+        <w:t>\</w:t>
+      </w:r>
+      <w:proofErr w:type="spellStart"/>
+      <w:r>
+        <w:rPr>
+          <w:rFonts w:ascii="Times New Roman" w:hAnsi="Times New Roman" w:cs="Times New Roman"/>
+          <w:sz w:val="28"/>
+          <w:szCs w:val="28"/>
+        </w:rPr>
+        <w:t>api</w:t>
+      </w:r>
+      <w:proofErr w:type="spellEnd"/>
+      <w:r>
+        <w:rPr>
+          <w:rFonts w:ascii="Times New Roman" w:hAnsi="Times New Roman" w:cs="Times New Roman"/>
+          <w:sz w:val="28"/>
+          <w:szCs w:val="28"/>
+        </w:rPr>
+        <w:t>\</w:t>
+      </w:r>
+      <w:proofErr w:type="spellStart"/>
+      <w:r>
+        <w:rPr>
+          <w:rFonts w:ascii="Times New Roman" w:hAnsi="Times New Roman" w:cs="Times New Roman"/>
+          <w:sz w:val="28"/>
+          <w:szCs w:val="28"/>
+        </w:rPr>
+        <w:t>analyze</w:t>
+      </w:r>
+      <w:proofErr w:type="spellEnd"/>
+      <w:r>
+        <w:rPr>
+          <w:rFonts w:ascii="Times New Roman" w:hAnsi="Times New Roman" w:cs="Times New Roman"/>
+          <w:sz w:val="28"/>
+          <w:szCs w:val="28"/>
+        </w:rPr>
+        <w:t xml:space="preserve">\ был создан файл </w:t>
+      </w:r>
+      <w:proofErr w:type="spellStart"/>
+      <w:r>
+        <w:rPr>
+          <w:rFonts w:ascii="Times New Roman" w:hAnsi="Times New Roman" w:cs="Times New Roman"/>
+          <w:sz w:val="28"/>
+          <w:szCs w:val="28"/>
+        </w:rPr>
+        <w:t>route.ts</w:t>
+      </w:r>
+      <w:proofErr w:type="spellEnd"/>
+      <w:r>
+        <w:rPr>
+          <w:rFonts w:ascii="Times New Roman" w:hAnsi="Times New Roman" w:cs="Times New Roman"/>
+          <w:sz w:val="28"/>
+          <w:szCs w:val="28"/>
+        </w:rPr>
+        <w:t xml:space="preserve">. Маршрут принимает POST-запрос с URL репозитория, извлекает из него </w:t>
+      </w:r>
+      <w:proofErr w:type="spellStart"/>
+      <w:r>
+        <w:rPr>
+          <w:rFonts w:ascii="Times New Roman" w:hAnsi="Times New Roman" w:cs="Times New Roman"/>
+          <w:sz w:val="28"/>
+          <w:szCs w:val="28"/>
+        </w:rPr>
+        <w:t>owner</w:t>
+      </w:r>
+      <w:proofErr w:type="spellEnd"/>
+      <w:r>
+        <w:rPr>
+          <w:rFonts w:ascii="Times New Roman" w:hAnsi="Times New Roman" w:cs="Times New Roman"/>
+          <w:sz w:val="28"/>
+          <w:szCs w:val="28"/>
+        </w:rPr>
+        <w:t xml:space="preserve"> и </w:t>
+      </w:r>
+      <w:proofErr w:type="spellStart"/>
+      <w:r>
+        <w:rPr>
+          <w:rFonts w:ascii="Times New Roman" w:hAnsi="Times New Roman" w:cs="Times New Roman"/>
+          <w:sz w:val="28"/>
+          <w:szCs w:val="28"/>
+        </w:rPr>
+        <w:t>repo</w:t>
+      </w:r>
+      <w:proofErr w:type="spellEnd"/>
+      <w:r>
+        <w:rPr>
+          <w:rFonts w:ascii="Times New Roman" w:hAnsi="Times New Roman" w:cs="Times New Roman"/>
+          <w:sz w:val="28"/>
+          <w:szCs w:val="28"/>
+        </w:rPr>
+        <w:t xml:space="preserve">, затем параллельно обращается к трём </w:t>
+      </w:r>
+      <w:proofErr w:type="spellStart"/>
+      <w:r>
+        <w:rPr>
+          <w:rFonts w:ascii="Times New Roman" w:hAnsi="Times New Roman" w:cs="Times New Roman"/>
+          <w:sz w:val="28"/>
+          <w:szCs w:val="28"/>
+        </w:rPr>
+        <w:t>эндпоинтам</w:t>
+      </w:r>
+      <w:proofErr w:type="spellEnd"/>
+      <w:r>
+        <w:rPr>
+          <w:rFonts w:ascii="Times New Roman" w:hAnsi="Times New Roman" w:cs="Times New Roman"/>
+          <w:sz w:val="28"/>
+          <w:szCs w:val="28"/>
+        </w:rPr>
+        <w:t xml:space="preserve"> </w:t>
+      </w:r>
+      <w:proofErr w:type="spellStart"/>
+      <w:r>
+        <w:rPr>
+          <w:rFonts w:ascii="Times New Roman" w:hAnsi="Times New Roman" w:cs="Times New Roman"/>
+          <w:sz w:val="28"/>
+          <w:szCs w:val="28"/>
+        </w:rPr>
+        <w:t>GitHub</w:t>
+      </w:r>
+      <w:proofErr w:type="spellEnd"/>
+      <w:r>
+        <w:rPr>
+          <w:rFonts w:ascii="Times New Roman" w:hAnsi="Times New Roman" w:cs="Times New Roman"/>
+          <w:sz w:val="28"/>
+          <w:szCs w:val="28"/>
+        </w:rPr>
+        <w:t xml:space="preserve"> REST API: /</w:t>
+      </w:r>
+      <w:proofErr w:type="spellStart"/>
+      <w:r>
+        <w:rPr>
+          <w:rFonts w:ascii="Times New Roman" w:hAnsi="Times New Roman" w:cs="Times New Roman"/>
+          <w:sz w:val="28"/>
+          <w:szCs w:val="28"/>
+        </w:rPr>
+        <w:t>commits</w:t>
+      </w:r>
+      <w:proofErr w:type="spellEnd"/>
+      <w:r>
+        <w:rPr>
+          <w:rFonts w:ascii="Times New Roman" w:hAnsi="Times New Roman" w:cs="Times New Roman"/>
+          <w:sz w:val="28"/>
+          <w:szCs w:val="28"/>
+        </w:rPr>
+        <w:t>, /</w:t>
+      </w:r>
+      <w:proofErr w:type="spellStart"/>
+      <w:r>
+        <w:rPr>
+          <w:rFonts w:ascii="Times New Roman" w:hAnsi="Times New Roman" w:cs="Times New Roman"/>
+          <w:sz w:val="28"/>
+          <w:szCs w:val="28"/>
+        </w:rPr>
+        <w:t>pulls</w:t>
+      </w:r>
+      <w:proofErr w:type="spellEnd"/>
+      <w:r>
+        <w:rPr>
+          <w:rFonts w:ascii="Times New Roman" w:hAnsi="Times New Roman" w:cs="Times New Roman"/>
+          <w:sz w:val="28"/>
+          <w:szCs w:val="28"/>
+        </w:rPr>
+        <w:t xml:space="preserve"> и /</w:t>
+      </w:r>
+      <w:proofErr w:type="spellStart"/>
+      <w:r>
+        <w:rPr>
+          <w:rFonts w:ascii="Times New Roman" w:hAnsi="Times New Roman" w:cs="Times New Roman"/>
+          <w:sz w:val="28"/>
+          <w:szCs w:val="28"/>
+        </w:rPr>
+        <w:t>repos</w:t>
+      </w:r>
+      <w:proofErr w:type="spellEnd"/>
+      <w:r>
+        <w:rPr>
+          <w:rFonts w:ascii="Times New Roman" w:hAnsi="Times New Roman" w:cs="Times New Roman"/>
+          <w:sz w:val="28"/>
+          <w:szCs w:val="28"/>
+        </w:rPr>
+        <w:t>/{</w:t>
+      </w:r>
+      <w:proofErr w:type="spellStart"/>
+      <w:r>
+        <w:rPr>
+          <w:rFonts w:ascii="Times New Roman" w:hAnsi="Times New Roman" w:cs="Times New Roman"/>
+          <w:sz w:val="28"/>
+          <w:szCs w:val="28"/>
+        </w:rPr>
+        <w:t>owner</w:t>
+      </w:r>
+      <w:proofErr w:type="spellEnd"/>
+      <w:r>
+        <w:rPr>
+          <w:rFonts w:ascii="Times New Roman" w:hAnsi="Times New Roman" w:cs="Times New Roman"/>
+          <w:sz w:val="28"/>
+          <w:szCs w:val="28"/>
+        </w:rPr>
+        <w:t>}/{</w:t>
+      </w:r>
+      <w:proofErr w:type="spellStart"/>
+      <w:r>
+        <w:rPr>
+          <w:rFonts w:ascii="Times New Roman" w:hAnsi="Times New Roman" w:cs="Times New Roman"/>
+          <w:sz w:val="28"/>
+          <w:szCs w:val="28"/>
+        </w:rPr>
+        <w:t>repo</w:t>
+      </w:r>
+      <w:proofErr w:type="spellEnd"/>
+      <w:r>
+        <w:rPr>
+          <w:rFonts w:ascii="Times New Roman" w:hAnsi="Times New Roman" w:cs="Times New Roman"/>
+          <w:sz w:val="28"/>
+          <w:szCs w:val="28"/>
+        </w:rPr>
+        <w:t xml:space="preserve">}. На основе полученных данных вычисляются: количество коммитов, </w:t>
+      </w:r>
+      <w:proofErr w:type="spellStart"/>
+      <w:r>
+        <w:rPr>
+          <w:rFonts w:ascii="Times New Roman" w:hAnsi="Times New Roman" w:cs="Times New Roman"/>
+          <w:sz w:val="28"/>
+          <w:szCs w:val="28"/>
+        </w:rPr>
+        <w:t>streak</w:t>
+      </w:r>
+      <w:proofErr w:type="spellEnd"/>
+      <w:r>
+        <w:rPr>
+          <w:rFonts w:ascii="Times New Roman" w:hAnsi="Times New Roman" w:cs="Times New Roman"/>
+          <w:sz w:val="28"/>
+          <w:szCs w:val="28"/>
+        </w:rPr>
+        <w:t xml:space="preserve"> (количество подряд идущих дней с коммитами), количество </w:t>
+      </w:r>
+      <w:proofErr w:type="spellStart"/>
+      <w:r>
+        <w:rPr>
+          <w:rFonts w:ascii="Times New Roman" w:hAnsi="Times New Roman" w:cs="Times New Roman"/>
+          <w:sz w:val="28"/>
+          <w:szCs w:val="28"/>
+        </w:rPr>
+        <w:t>merged</w:t>
+      </w:r>
+      <w:proofErr w:type="spellEnd"/>
+      <w:r>
+        <w:rPr>
+          <w:rFonts w:ascii="Times New Roman" w:hAnsi="Times New Roman" w:cs="Times New Roman"/>
+          <w:sz w:val="28"/>
+          <w:szCs w:val="28"/>
+        </w:rPr>
+        <w:t xml:space="preserve"> и </w:t>
+      </w:r>
+      <w:proofErr w:type="spellStart"/>
+      <w:r>
+        <w:rPr>
+          <w:rFonts w:ascii="Times New Roman" w:hAnsi="Times New Roman" w:cs="Times New Roman"/>
+          <w:sz w:val="28"/>
+          <w:szCs w:val="28"/>
+        </w:rPr>
+        <w:t>open</w:t>
+      </w:r>
+      <w:proofErr w:type="spellEnd"/>
+      <w:r>
+        <w:rPr>
+          <w:rFonts w:ascii="Times New Roman" w:hAnsi="Times New Roman" w:cs="Times New Roman"/>
+          <w:sz w:val="28"/>
+          <w:szCs w:val="28"/>
+        </w:rPr>
+        <w:t xml:space="preserve"> </w:t>
+      </w:r>
+      <w:proofErr w:type="spellStart"/>
+      <w:r>
+        <w:rPr>
+          <w:rFonts w:ascii="Times New Roman" w:hAnsi="Times New Roman" w:cs="Times New Roman"/>
+          <w:sz w:val="28"/>
+          <w:szCs w:val="28"/>
+        </w:rPr>
+        <w:t>pull</w:t>
+      </w:r>
+      <w:proofErr w:type="spellEnd"/>
+      <w:r>
+        <w:rPr>
+          <w:rFonts w:ascii="Times New Roman" w:hAnsi="Times New Roman" w:cs="Times New Roman"/>
+          <w:sz w:val="28"/>
+          <w:szCs w:val="28"/>
+        </w:rPr>
+        <w:t xml:space="preserve"> </w:t>
+      </w:r>
+      <w:proofErr w:type="spellStart"/>
+      <w:r>
+        <w:rPr>
+          <w:rFonts w:ascii="Times New Roman" w:hAnsi="Times New Roman" w:cs="Times New Roman"/>
+          <w:sz w:val="28"/>
+          <w:szCs w:val="28"/>
+        </w:rPr>
+        <w:t>requests</w:t>
+      </w:r>
+      <w:proofErr w:type="spellEnd"/>
+      <w:r>
+        <w:rPr>
+          <w:rFonts w:ascii="Times New Roman" w:hAnsi="Times New Roman" w:cs="Times New Roman"/>
+          <w:sz w:val="28"/>
+          <w:szCs w:val="28"/>
+        </w:rPr>
+        <w:t xml:space="preserve">, а также среднее время от открытия PR </w:t>
+      </w:r>
+      <w:r>
+        <w:rPr>
+          <w:rFonts w:ascii="Times New Roman" w:hAnsi="Times New Roman" w:cs="Times New Roman"/>
+          <w:sz w:val="28"/>
+          <w:szCs w:val="28"/>
+        </w:rPr>
+        <w:lastRenderedPageBreak/>
+        <w:t>до его слияния (в днях). Все вычисленные метрики возвращаются в виде JSON-ответа.</w:t>
+      </w:r>
+    </w:p>
+    <w:p>
+      <w:pPr>
+        <w:spacing w:after="0" w:line="360" w:lineRule="auto"/>
+        <w:ind w:firstLine="709"/>
+        <w:jc w:val="both"/>
+        <w:rPr>
+          <w:rFonts w:ascii="Times New Roman" w:hAnsi="Times New Roman" w:cs="Times New Roman"/>
+          <w:sz w:val="28"/>
+          <w:szCs w:val="28"/>
+        </w:rPr>
+      </w:pPr>
+      <w:r>
+        <w:rPr>
+          <w:rFonts w:ascii="Times New Roman" w:hAnsi="Times New Roman" w:cs="Times New Roman"/>
+          <w:sz w:val="28"/>
+          <w:szCs w:val="28"/>
+        </w:rPr>
+        <w:t>Ключевой фрагмент маршрута:</w:t>
+      </w:r>
+    </w:p>
+    <w:p>
+      <w:pPr>
+        <w:spacing w:before="60" w:after="60" w:line="280" w:lineRule="auto"/>
+        <w:ind w:left="720"/>
+        <w:rPr>
+          <w:rFonts w:ascii="Courier New" w:hAnsi="Courier New" w:cs="Courier New"/>
+          <w:sz w:val="20"/>
+          <w:szCs w:val="20"/>
+          <w:lang w:val="en-US"/>
+        </w:rPr>
+      </w:pPr>
+      <w:r>
+        <w:rPr>
+          <w:rFonts w:ascii="Courier New" w:hAnsi="Courier New" w:cs="Courier New"/>
+          <w:sz w:val="20"/>
+          <w:szCs w:val="20"/>
+          <w:lang w:val="en-US"/>
+        </w:rPr>
+        <w:t xml:space="preserve">// </w:t>
+      </w:r>
+      <w:proofErr w:type="spellStart"/>
+      <w:r>
+        <w:rPr>
+          <w:rFonts w:ascii="Courier New" w:hAnsi="Courier New" w:cs="Courier New"/>
+          <w:sz w:val="20"/>
+          <w:szCs w:val="20"/>
+          <w:lang w:val="en-US"/>
+        </w:rPr>
+        <w:t>src</w:t>
+      </w:r>
+      <w:proofErr w:type="spellEnd"/>
+      <w:r>
+        <w:rPr>
+          <w:rFonts w:ascii="Courier New" w:hAnsi="Courier New" w:cs="Courier New"/>
+          <w:sz w:val="20"/>
+          <w:szCs w:val="20"/>
+          <w:lang w:val="en-US"/>
+        </w:rPr>
+        <w:t>/app/</w:t>
+      </w:r>
+      <w:proofErr w:type="spellStart"/>
+      <w:r>
+        <w:rPr>
+          <w:rFonts w:ascii="Courier New" w:hAnsi="Courier New" w:cs="Courier New"/>
+          <w:sz w:val="20"/>
+          <w:szCs w:val="20"/>
+          <w:lang w:val="en-US"/>
+        </w:rPr>
+        <w:t>api</w:t>
+      </w:r>
+      <w:proofErr w:type="spellEnd"/>
+      <w:r>
+        <w:rPr>
+          <w:rFonts w:ascii="Courier New" w:hAnsi="Courier New" w:cs="Courier New"/>
+          <w:sz w:val="20"/>
+          <w:szCs w:val="20"/>
+          <w:lang w:val="en-US"/>
+        </w:rPr>
+        <w:t>/analyze/</w:t>
+      </w:r>
+      <w:proofErr w:type="spellStart"/>
+      <w:r>
+        <w:rPr>
+          <w:rFonts w:ascii="Courier New" w:hAnsi="Courier New" w:cs="Courier New"/>
+          <w:sz w:val="20"/>
+          <w:szCs w:val="20"/>
+          <w:lang w:val="en-US"/>
+        </w:rPr>
+        <w:t>route.ts</w:t>
+      </w:r>
+      <w:proofErr w:type="spellEnd"/>
+    </w:p>
+    <w:p>
+      <w:pPr>
+        <w:spacing w:before="60" w:after="60" w:line="280" w:lineRule="auto"/>
+        <w:ind w:left="720"/>
+        <w:rPr>
+          <w:rFonts w:ascii="Courier New" w:hAnsi="Courier New" w:cs="Courier New"/>
+          <w:sz w:val="20"/>
+          <w:szCs w:val="20"/>
+          <w:lang w:val="en-US"/>
+        </w:rPr>
+      </w:pPr>
+      <w:r>
+        <w:rPr>
+          <w:rFonts w:ascii="Courier New" w:hAnsi="Courier New" w:cs="Courier New"/>
+          <w:sz w:val="20"/>
+          <w:szCs w:val="20"/>
+          <w:lang w:val="en-US"/>
+        </w:rPr>
+        <w:t xml:space="preserve">export async function POST(req: </w:t>
+      </w:r>
+      <w:proofErr w:type="spellStart"/>
+      <w:r>
+        <w:rPr>
+          <w:rFonts w:ascii="Courier New" w:hAnsi="Courier New" w:cs="Courier New"/>
+          <w:sz w:val="20"/>
+          <w:szCs w:val="20"/>
+          <w:lang w:val="en-US"/>
+        </w:rPr>
+        <w:t>NextRequest</w:t>
+      </w:r>
+      <w:proofErr w:type="spellEnd"/>
+      <w:r>
+        <w:rPr>
+          <w:rFonts w:ascii="Courier New" w:hAnsi="Courier New" w:cs="Courier New"/>
+          <w:sz w:val="20"/>
+          <w:szCs w:val="20"/>
+          <w:lang w:val="en-US"/>
+        </w:rPr>
+        <w:t>) {</w:t>
+      </w:r>
+    </w:p>
+    <w:p>
+      <w:pPr>
+        <w:spacing w:before="60" w:after="60" w:line="280" w:lineRule="auto"/>
+        <w:ind w:left="720"/>
+        <w:rPr>
+          <w:rFonts w:ascii="Courier New" w:hAnsi="Courier New" w:cs="Courier New"/>
+          <w:sz w:val="20"/>
+          <w:szCs w:val="20"/>
+          <w:lang w:val="en-US"/>
+        </w:rPr>
+      </w:pPr>
+      <w:r>
+        <w:rPr>
+          <w:rFonts w:ascii="Courier New" w:hAnsi="Courier New" w:cs="Courier New"/>
+          <w:sz w:val="20"/>
+          <w:szCs w:val="20"/>
+          <w:lang w:val="en-US"/>
+        </w:rPr>
+        <w:t xml:space="preserve">  const { </w:t>
+      </w:r>
+      <w:proofErr w:type="spellStart"/>
+      <w:r>
+        <w:rPr>
+          <w:rFonts w:ascii="Courier New" w:hAnsi="Courier New" w:cs="Courier New"/>
+          <w:sz w:val="20"/>
+          <w:szCs w:val="20"/>
+          <w:lang w:val="en-US"/>
+        </w:rPr>
+        <w:t>repoUrl</w:t>
+      </w:r>
+      <w:proofErr w:type="spellEnd"/>
+      <w:r>
+        <w:rPr>
+          <w:rFonts w:ascii="Courier New" w:hAnsi="Courier New" w:cs="Courier New"/>
+          <w:sz w:val="20"/>
+          <w:szCs w:val="20"/>
+          <w:lang w:val="en-US"/>
+        </w:rPr>
+        <w:t xml:space="preserve"> } = await </w:t>
+      </w:r>
+      <w:proofErr w:type="spellStart"/>
+      <w:r>
+        <w:rPr>
+          <w:rFonts w:ascii="Courier New" w:hAnsi="Courier New" w:cs="Courier New"/>
+          <w:sz w:val="20"/>
+          <w:szCs w:val="20"/>
+          <w:lang w:val="en-US"/>
+        </w:rPr>
+        <w:t>req.json</w:t>
+      </w:r>
+      <w:proofErr w:type="spellEnd"/>
+      <w:r>
+        <w:rPr>
+          <w:rFonts w:ascii="Courier New" w:hAnsi="Courier New" w:cs="Courier New"/>
+          <w:sz w:val="20"/>
+          <w:szCs w:val="20"/>
+          <w:lang w:val="en-US"/>
+        </w:rPr>
+        <w:t>()</w:t>
+      </w:r>
+    </w:p>
+    <w:p>
+      <w:pPr>
+        <w:spacing w:before="60" w:after="60" w:line="280" w:lineRule="auto"/>
+        <w:ind w:left="720"/>
+        <w:rPr>
+          <w:rFonts w:ascii="Courier New" w:hAnsi="Courier New" w:cs="Courier New"/>
+          <w:sz w:val="20"/>
+          <w:szCs w:val="20"/>
+          <w:lang w:val="en-US"/>
+        </w:rPr>
+      </w:pPr>
+      <w:r>
+        <w:rPr>
+          <w:rFonts w:ascii="Courier New" w:hAnsi="Courier New" w:cs="Courier New"/>
+          <w:sz w:val="20"/>
+          <w:szCs w:val="20"/>
+          <w:lang w:val="en-US"/>
+        </w:rPr>
+        <w:t xml:space="preserve">  const match = </w:t>
+      </w:r>
+      <w:proofErr w:type="spellStart"/>
+      <w:r>
+        <w:rPr>
+          <w:rFonts w:ascii="Courier New" w:hAnsi="Courier New" w:cs="Courier New"/>
+          <w:sz w:val="20"/>
+          <w:szCs w:val="20"/>
+          <w:lang w:val="en-US"/>
+        </w:rPr>
+        <w:t>repoUrl.match</w:t>
+      </w:r>
+      <w:proofErr w:type="spellEnd"/>
+      <w:r>
+        <w:rPr>
+          <w:rFonts w:ascii="Courier New" w:hAnsi="Courier New" w:cs="Courier New"/>
+          <w:sz w:val="20"/>
+          <w:szCs w:val="20"/>
+          <w:lang w:val="en-US"/>
+        </w:rPr>
+        <w:t>(</w:t>
+      </w:r>
+    </w:p>
+    <w:p>
+      <w:pPr>
+        <w:spacing w:before="60" w:after="60" w:line="280" w:lineRule="auto"/>
+        <w:ind w:left="720"/>
+        <w:rPr>
+          <w:rFonts w:ascii="Courier New" w:hAnsi="Courier New" w:cs="Courier New"/>
+          <w:sz w:val="20"/>
+          <w:szCs w:val="20"/>
+          <w:lang w:val="en-US"/>
+        </w:rPr>
+      </w:pPr>
+      <w:r>
+        <w:rPr>
+          <w:rFonts w:ascii="Courier New" w:hAnsi="Courier New" w:cs="Courier New"/>
+          <w:sz w:val="20"/>
+          <w:szCs w:val="20"/>
+          <w:lang w:val="en-US"/>
+        </w:rPr>
+        <w:t xml:space="preserve">    /</w:t>
+      </w:r>
+      <w:proofErr w:type="spellStart"/>
+      <w:proofErr w:type="gramStart"/>
+      <w:r>
+        <w:rPr>
+          <w:rFonts w:ascii="Courier New" w:hAnsi="Courier New" w:cs="Courier New"/>
+          <w:sz w:val="20"/>
+          <w:szCs w:val="20"/>
+          <w:lang w:val="en-US"/>
+        </w:rPr>
+        <w:t>github</w:t>
+      </w:r>
+      <w:proofErr w:type="spellEnd"/>
+      <w:proofErr w:type="gramEnd"/>
+      <w:r>
+        <w:rPr>
+          <w:rFonts w:ascii="Courier New" w:hAnsi="Courier New" w:cs="Courier New"/>
+          <w:sz w:val="20"/>
+          <w:szCs w:val="20"/>
+          <w:lang w:val="en-US"/>
+        </w:rPr>
+        <w:t>\.com\/([^\/]+)\/([^\/]+?)</w:t>
+      </w:r>
+      <w:proofErr w:type="gramStart"/>
+      <w:r>
+        <w:rPr>
+          <w:rFonts w:ascii="Courier New" w:hAnsi="Courier New" w:cs="Courier New"/>
+          <w:sz w:val="20"/>
+          <w:szCs w:val="20"/>
+          <w:lang w:val="en-US"/>
+        </w:rPr>
+        <w:t>(?:</w:t>
+      </w:r>
+      <w:proofErr w:type="gramEnd"/>
+      <w:r>
+        <w:rPr>
+          <w:rFonts w:ascii="Courier New" w:hAnsi="Courier New" w:cs="Courier New"/>
+          <w:sz w:val="20"/>
+          <w:szCs w:val="20"/>
+          <w:lang w:val="en-US"/>
+        </w:rPr>
+        <w:t>\.git)?$/)</w:t>
+      </w:r>
+    </w:p>
+    <w:p>
+      <w:pPr>
+        <w:spacing w:before="60" w:after="60" w:line="280" w:lineRule="auto"/>
+        <w:ind w:left="720"/>
+        <w:rPr>
+          <w:rFonts w:ascii="Courier New" w:hAnsi="Courier New" w:cs="Courier New"/>
+          <w:sz w:val="20"/>
+          <w:szCs w:val="20"/>
+          <w:lang w:val="en-US"/>
+        </w:rPr>
+      </w:pPr>
+      <w:r>
+        <w:rPr>
+          <w:rFonts w:ascii="Courier New" w:hAnsi="Courier New" w:cs="Courier New"/>
+          <w:sz w:val="20"/>
+          <w:szCs w:val="20"/>
+          <w:lang w:val="en-US"/>
+        </w:rPr>
+        <w:t xml:space="preserve">  const [, owner, repo] = match</w:t>
+      </w:r>
+    </w:p>
+    <w:p>
+      <w:pPr>
+        <w:spacing w:before="60" w:after="60" w:line="280" w:lineRule="auto"/>
+        <w:ind w:left="720"/>
+        <w:rPr>
+          <w:rFonts w:ascii="Courier New" w:hAnsi="Courier New" w:cs="Courier New"/>
+          <w:sz w:val="20"/>
+          <w:szCs w:val="20"/>
+          <w:lang w:val="en-US"/>
+        </w:rPr>
+      </w:pPr>
+      <w:r>
+        <w:rPr>
+          <w:rFonts w:ascii="Courier New" w:hAnsi="Courier New" w:cs="Courier New"/>
+          <w:sz w:val="20"/>
+          <w:szCs w:val="20"/>
+          <w:lang w:val="en-US"/>
+        </w:rPr>
+        <w:t xml:space="preserve">  const [</w:t>
+      </w:r>
+      <w:proofErr w:type="spellStart"/>
+      <w:r>
+        <w:rPr>
+          <w:rFonts w:ascii="Courier New" w:hAnsi="Courier New" w:cs="Courier New"/>
+          <w:sz w:val="20"/>
+          <w:szCs w:val="20"/>
+          <w:lang w:val="en-US"/>
+        </w:rPr>
+        <w:t>commitsRes</w:t>
+      </w:r>
+      <w:proofErr w:type="spellEnd"/>
+      <w:r>
+        <w:rPr>
+          <w:rFonts w:ascii="Courier New" w:hAnsi="Courier New" w:cs="Courier New"/>
+          <w:sz w:val="20"/>
+          <w:szCs w:val="20"/>
+          <w:lang w:val="en-US"/>
+        </w:rPr>
+        <w:t xml:space="preserve">, </w:t>
+      </w:r>
+      <w:proofErr w:type="spellStart"/>
+      <w:r>
+        <w:rPr>
+          <w:rFonts w:ascii="Courier New" w:hAnsi="Courier New" w:cs="Courier New"/>
+          <w:sz w:val="20"/>
+          <w:szCs w:val="20"/>
+          <w:lang w:val="en-US"/>
+        </w:rPr>
+        <w:t>prsRes</w:t>
+      </w:r>
+      <w:proofErr w:type="spellEnd"/>
+      <w:r>
+        <w:rPr>
+          <w:rFonts w:ascii="Courier New" w:hAnsi="Courier New" w:cs="Courier New"/>
+          <w:sz w:val="20"/>
+          <w:szCs w:val="20"/>
+          <w:lang w:val="en-US"/>
+        </w:rPr>
+        <w:t xml:space="preserve">, </w:t>
+      </w:r>
+      <w:proofErr w:type="spellStart"/>
+      <w:r>
+        <w:rPr>
+          <w:rFonts w:ascii="Courier New" w:hAnsi="Courier New" w:cs="Courier New"/>
+          <w:sz w:val="20"/>
+          <w:szCs w:val="20"/>
+          <w:lang w:val="en-US"/>
+        </w:rPr>
+        <w:t>repoRes</w:t>
+      </w:r>
+      <w:proofErr w:type="spellEnd"/>
+      <w:r>
+        <w:rPr>
+          <w:rFonts w:ascii="Courier New" w:hAnsi="Courier New" w:cs="Courier New"/>
+          <w:sz w:val="20"/>
+          <w:szCs w:val="20"/>
+          <w:lang w:val="en-US"/>
+        </w:rPr>
+        <w:t xml:space="preserve">] = await </w:t>
+      </w:r>
+      <w:proofErr w:type="spellStart"/>
+      <w:r>
+        <w:rPr>
+          <w:rFonts w:ascii="Courier New" w:hAnsi="Courier New" w:cs="Courier New"/>
+          <w:sz w:val="20"/>
+          <w:szCs w:val="20"/>
+          <w:lang w:val="en-US"/>
+        </w:rPr>
+        <w:t>Promise.all</w:t>
+      </w:r>
+      <w:proofErr w:type="spellEnd"/>
+      <w:r>
+        <w:rPr>
+          <w:rFonts w:ascii="Courier New" w:hAnsi="Courier New" w:cs="Courier New"/>
+          <w:sz w:val="20"/>
+          <w:szCs w:val="20"/>
+          <w:lang w:val="en-US"/>
+        </w:rPr>
+        <w:t>([</w:t>
+      </w:r>
+    </w:p>
+    <w:p>
+      <w:pPr>
+        <w:spacing w:before="60" w:after="60" w:line="280" w:lineRule="auto"/>
+        <w:ind w:left="720"/>
+        <w:rPr>
+          <w:rFonts w:ascii="Courier New" w:hAnsi="Courier New" w:cs="Courier New"/>
+          <w:sz w:val="20"/>
+          <w:szCs w:val="20"/>
+          <w:lang w:val="en-US"/>
+        </w:rPr>
+      </w:pPr>
+      <w:r>
+        <w:rPr>
+          <w:rFonts w:ascii="Courier New" w:hAnsi="Courier New" w:cs="Courier New"/>
+          <w:sz w:val="20"/>
+          <w:szCs w:val="20"/>
+          <w:lang w:val="en-US"/>
+        </w:rPr>
+        <w:t xml:space="preserve">    fetch(`https://api.github.com/repos/${owner}/${repo}/commits`),</w:t>
+      </w:r>
+    </w:p>
+    <w:p>
+      <w:pPr>
+        <w:spacing w:before="60" w:after="60" w:line="280" w:lineRule="auto"/>
+        <w:ind w:left="720"/>
+        <w:rPr>
+          <w:rFonts w:ascii="Courier New" w:hAnsi="Courier New" w:cs="Courier New"/>
+          <w:sz w:val="20"/>
+          <w:szCs w:val="20"/>
+          <w:lang w:val="en-US"/>
+        </w:rPr>
+      </w:pPr>
+      <w:r>
+        <w:rPr>
+          <w:rFonts w:ascii="Courier New" w:hAnsi="Courier New" w:cs="Courier New"/>
+          <w:sz w:val="20"/>
+          <w:szCs w:val="20"/>
+          <w:lang w:val="en-US"/>
+        </w:rPr>
+        <w:t xml:space="preserve">    fetch(`https://api.github.com/repos/${owner}/${repo}/pulls?state=all`),</w:t>
+      </w:r>
+    </w:p>
+    <w:p>
+      <w:pPr>
+        <w:spacing w:before="60" w:after="60" w:line="280" w:lineRule="auto"/>
+        <w:ind w:left="720"/>
+        <w:rPr>
+          <w:rFonts w:ascii="Courier New" w:hAnsi="Courier New" w:cs="Courier New"/>
+          <w:sz w:val="20"/>
+          <w:szCs w:val="20"/>
+          <w:lang w:val="en-US"/>
+        </w:rPr>
+      </w:pPr>
+      <w:r>
+        <w:rPr>
+          <w:rFonts w:ascii="Courier New" w:hAnsi="Courier New" w:cs="Courier New"/>
+          <w:sz w:val="20"/>
+          <w:szCs w:val="20"/>
+          <w:lang w:val="en-US"/>
+        </w:rPr>
+        <w:t xml:space="preserve">    fetch(`https://api.github.com/repos/${owner}/${repo}`)</w:t>
+      </w:r>
+    </w:p>
+    <w:p>
+      <w:pPr>
+        <w:spacing w:before="60" w:after="60" w:line="280" w:lineRule="auto"/>
+        <w:ind w:left="720"/>
+        <w:rPr>
+          <w:rFonts w:ascii="Courier New" w:hAnsi="Courier New" w:cs="Courier New"/>
+          <w:sz w:val="20"/>
+          <w:szCs w:val="20"/>
+          <w:lang w:val="en-US"/>
+        </w:rPr>
+      </w:pPr>
+      <w:r>
+        <w:rPr>
+          <w:rFonts w:ascii="Courier New" w:hAnsi="Courier New" w:cs="Courier New"/>
+          <w:sz w:val="20"/>
+          <w:szCs w:val="20"/>
+          <w:lang w:val="en-US"/>
+        </w:rPr>
+        <w:t xml:space="preserve">  ])</w:t>
+      </w:r>
+    </w:p>
+    <w:p>
+      <w:pPr>
+        <w:spacing w:before="60" w:after="60" w:line="280" w:lineRule="auto"/>
+        <w:ind w:left="720"/>
+        <w:rPr>
+          <w:rFonts w:ascii="Courier New" w:hAnsi="Courier New" w:cs="Courier New"/>
+          <w:sz w:val="20"/>
+          <w:szCs w:val="20"/>
+          <w:lang w:val="en-US"/>
+        </w:rPr>
+      </w:pPr>
+      <w:r>
+        <w:rPr>
+          <w:rFonts w:ascii="Courier New" w:hAnsi="Courier New" w:cs="Courier New"/>
+          <w:sz w:val="20"/>
+          <w:szCs w:val="20"/>
+          <w:lang w:val="en-US"/>
+        </w:rPr>
+        <w:t xml:space="preserve">  // </w:t>
+      </w:r>
+      <w:r>
+        <w:rPr>
+          <w:rFonts w:ascii="Courier New" w:hAnsi="Courier New" w:cs="Courier New"/>
+          <w:sz w:val="20"/>
+          <w:szCs w:val="20"/>
+        </w:rPr>
+        <w:t>вычисление</w:t>
+      </w:r>
+      <w:r>
+        <w:rPr>
+          <w:rFonts w:ascii="Courier New" w:hAnsi="Courier New" w:cs="Courier New"/>
+          <w:sz w:val="20"/>
+          <w:szCs w:val="20"/>
+          <w:lang w:val="en-US"/>
+        </w:rPr>
+        <w:t xml:space="preserve"> </w:t>
+      </w:r>
+      <w:r>
+        <w:rPr>
+          <w:rFonts w:ascii="Courier New" w:hAnsi="Courier New" w:cs="Courier New"/>
+          <w:sz w:val="20"/>
+          <w:szCs w:val="20"/>
+        </w:rPr>
+        <w:t>метрик</w:t>
+      </w:r>
+      <w:r>
+        <w:rPr>
+          <w:rFonts w:ascii="Courier New" w:hAnsi="Courier New" w:cs="Courier New"/>
+          <w:sz w:val="20"/>
+          <w:szCs w:val="20"/>
+          <w:lang w:val="en-US"/>
+        </w:rPr>
+        <w:t>...</w:t>
+      </w:r>
+    </w:p>
+    <w:p>
+      <w:pPr>
+        <w:spacing w:before="60" w:after="60" w:line="280" w:lineRule="auto"/>
+        <w:ind w:left="720"/>
+        <w:rPr>
+          <w:rFonts w:ascii="Courier New" w:hAnsi="Courier New" w:cs="Courier New"/>
+          <w:sz w:val="20"/>
+          <w:szCs w:val="20"/>
+          <w:lang w:val="en-US"/>
+        </w:rPr>
+      </w:pPr>
+      <w:r>
+        <w:rPr>
+          <w:rFonts w:ascii="Courier New" w:hAnsi="Courier New" w:cs="Courier New"/>
+          <w:sz w:val="20"/>
+          <w:szCs w:val="20"/>
+          <w:lang w:val="en-US"/>
+        </w:rPr>
+        <w:t xml:space="preserve">  return </w:t>
+      </w:r>
+      <w:proofErr w:type="spellStart"/>
+      <w:r>
+        <w:rPr>
+          <w:rFonts w:ascii="Courier New" w:hAnsi="Courier New" w:cs="Courier New"/>
+          <w:sz w:val="20"/>
+          <w:szCs w:val="20"/>
+          <w:lang w:val="en-US"/>
+        </w:rPr>
+        <w:t>NextResponse.json</w:t>
+      </w:r>
+      <w:proofErr w:type="spellEnd"/>
+      <w:r>
+        <w:rPr>
+          <w:rFonts w:ascii="Courier New" w:hAnsi="Courier New" w:cs="Courier New"/>
+          <w:sz w:val="20"/>
+          <w:szCs w:val="20"/>
+          <w:lang w:val="en-US"/>
+        </w:rPr>
+        <w:t xml:space="preserve">({ commits, streak, </w:t>
+      </w:r>
+      <w:proofErr w:type="spellStart"/>
+      <w:r>
+        <w:rPr>
+          <w:rFonts w:ascii="Courier New" w:hAnsi="Courier New" w:cs="Courier New"/>
+          <w:sz w:val="20"/>
+          <w:szCs w:val="20"/>
+          <w:lang w:val="en-US"/>
+        </w:rPr>
+        <w:t>mergedPrs</w:t>
+      </w:r>
+      <w:proofErr w:type="spellEnd"/>
+      <w:r>
+        <w:rPr>
+          <w:rFonts w:ascii="Courier New" w:hAnsi="Courier New" w:cs="Courier New"/>
+          <w:sz w:val="20"/>
+          <w:szCs w:val="20"/>
+          <w:lang w:val="en-US"/>
+        </w:rPr>
+        <w:t xml:space="preserve">, </w:t>
+      </w:r>
+      <w:proofErr w:type="spellStart"/>
+      <w:r>
+        <w:rPr>
+          <w:rFonts w:ascii="Courier New" w:hAnsi="Courier New" w:cs="Courier New"/>
+          <w:sz w:val="20"/>
+          <w:szCs w:val="20"/>
+          <w:lang w:val="en-US"/>
+        </w:rPr>
+        <w:t>openPrs</w:t>
+      </w:r>
+      <w:proofErr w:type="spellEnd"/>
+      <w:r>
+        <w:rPr>
+          <w:rFonts w:ascii="Courier New" w:hAnsi="Courier New" w:cs="Courier New"/>
+          <w:sz w:val="20"/>
+          <w:szCs w:val="20"/>
+          <w:lang w:val="en-US"/>
+        </w:rPr>
+        <w:t>, ... })</w:t>
+      </w:r>
+    </w:p>
+    <w:p>
+      <w:pPr>
+        <w:spacing w:before="60" w:after="60" w:line="280" w:lineRule="auto"/>
+        <w:ind w:left="720"/>
+        <w:rPr>
+          <w:rFonts w:ascii="Courier New" w:hAnsi="Courier New" w:cs="Courier New"/>
+          <w:sz w:val="20"/>
+          <w:szCs w:val="20"/>
+        </w:rPr>
+      </w:pPr>
+      <w:r>
+        <w:rPr>
+          <w:rFonts w:ascii="Courier New" w:hAnsi="Courier New" w:cs="Courier New"/>
+          <w:sz w:val="20"/>
+          <w:szCs w:val="20"/>
+        </w:rPr>
+        <w:t>}</w:t>
+      </w:r>
+    </w:p>
+    <w:p>
+      <w:pPr>
+        <w:spacing w:before="120" w:after="60" w:line="360" w:lineRule="auto"/>
+        <w:ind w:firstLine="709"/>
+        <w:jc w:val="both"/>
+        <w:rPr>
+          <w:rFonts w:ascii="Times New Roman" w:hAnsi="Times New Roman" w:cs="Times New Roman"/>
+          <w:b/>
+          <w:bCs/>
+          <w:sz w:val="28"/>
+          <w:szCs w:val="28"/>
+        </w:rPr>
+      </w:pPr>
+      <w:r>
+        <w:rPr>
+          <w:rFonts w:ascii="Times New Roman" w:hAnsi="Times New Roman" w:cs="Times New Roman"/>
+          <w:b/>
+          <w:bCs/>
+          <w:sz w:val="28"/>
+          <w:szCs w:val="28"/>
+        </w:rPr>
+        <w:t xml:space="preserve">Шаг 3. Обновление обработчика </w:t>
+      </w:r>
+      <w:proofErr w:type="spellStart"/>
+      <w:r>
+        <w:rPr>
+          <w:rFonts w:ascii="Times New Roman" w:hAnsi="Times New Roman" w:cs="Times New Roman"/>
+          <w:b/>
+          <w:bCs/>
+          <w:sz w:val="28"/>
+          <w:szCs w:val="28"/>
+        </w:rPr>
+        <w:t>handleSubmit</w:t>
+      </w:r>
+      <w:proofErr w:type="spellEnd"/>
+      <w:r>
+        <w:rPr>
+          <w:rFonts w:ascii="Times New Roman" w:hAnsi="Times New Roman" w:cs="Times New Roman"/>
+          <w:b/>
+          <w:bCs/>
+          <w:sz w:val="28"/>
+          <w:szCs w:val="28"/>
+        </w:rPr>
+        <w:t xml:space="preserve"> в </w:t>
+      </w:r>
+      <w:proofErr w:type="spellStart"/>
+      <w:r>
+        <w:rPr>
+          <w:rFonts w:ascii="Times New Roman" w:hAnsi="Times New Roman" w:cs="Times New Roman"/>
+          <w:b/>
+          <w:bCs/>
+          <w:sz w:val="28"/>
+          <w:szCs w:val="28"/>
+        </w:rPr>
+        <w:t>hero.tsx</w:t>
+      </w:r>
+      <w:proofErr w:type="spellEnd"/>
+    </w:p>
+    <w:p>
+      <w:pPr>
+        <w:spacing w:after="0" w:line="360" w:lineRule="auto"/>
+        <w:ind w:firstLine="709"/>
+        <w:jc w:val="both"/>
+        <w:rPr>
+          <w:rFonts w:ascii="Times New Roman" w:hAnsi="Times New Roman" w:cs="Times New Roman"/>
+          <w:sz w:val="28"/>
+          <w:szCs w:val="28"/>
+        </w:rPr>
+      </w:pPr>
+      <w:r>
+        <w:rPr>
+          <w:rFonts w:ascii="Times New Roman" w:hAnsi="Times New Roman" w:cs="Times New Roman"/>
+          <w:sz w:val="28"/>
+          <w:szCs w:val="28"/>
+        </w:rPr>
+        <w:t xml:space="preserve">В компоненте </w:t>
+      </w:r>
+      <w:proofErr w:type="spellStart"/>
+      <w:r>
+        <w:rPr>
+          <w:rFonts w:ascii="Times New Roman" w:hAnsi="Times New Roman" w:cs="Times New Roman"/>
+          <w:sz w:val="28"/>
+          <w:szCs w:val="28"/>
+        </w:rPr>
+        <w:t>src</w:t>
+      </w:r>
+      <w:proofErr w:type="spellEnd"/>
+      <w:r>
+        <w:rPr>
+          <w:rFonts w:ascii="Times New Roman" w:hAnsi="Times New Roman" w:cs="Times New Roman"/>
+          <w:sz w:val="28"/>
+          <w:szCs w:val="28"/>
+        </w:rPr>
+        <w:t>/</w:t>
+      </w:r>
+      <w:proofErr w:type="spellStart"/>
+      <w:r>
+        <w:rPr>
+          <w:rFonts w:ascii="Times New Roman" w:hAnsi="Times New Roman" w:cs="Times New Roman"/>
+          <w:sz w:val="28"/>
+          <w:szCs w:val="28"/>
+        </w:rPr>
+        <w:t>components</w:t>
+      </w:r>
+      <w:proofErr w:type="spellEnd"/>
+      <w:r>
+        <w:rPr>
+          <w:rFonts w:ascii="Times New Roman" w:hAnsi="Times New Roman" w:cs="Times New Roman"/>
+          <w:sz w:val="28"/>
+          <w:szCs w:val="28"/>
+        </w:rPr>
+        <w:t>/</w:t>
+      </w:r>
+      <w:proofErr w:type="spellStart"/>
+      <w:r>
+        <w:rPr>
+          <w:rFonts w:ascii="Times New Roman" w:hAnsi="Times New Roman" w:cs="Times New Roman"/>
+          <w:sz w:val="28"/>
+          <w:szCs w:val="28"/>
+        </w:rPr>
+        <w:t>sections</w:t>
+      </w:r>
+      <w:proofErr w:type="spellEnd"/>
+      <w:r>
+        <w:rPr>
+          <w:rFonts w:ascii="Times New Roman" w:hAnsi="Times New Roman" w:cs="Times New Roman"/>
+          <w:sz w:val="28"/>
+          <w:szCs w:val="28"/>
+        </w:rPr>
+        <w:t>/</w:t>
+      </w:r>
+      <w:proofErr w:type="spellStart"/>
+      <w:r>
+        <w:rPr>
+          <w:rFonts w:ascii="Times New Roman" w:hAnsi="Times New Roman" w:cs="Times New Roman"/>
+          <w:sz w:val="28"/>
+          <w:szCs w:val="28"/>
+        </w:rPr>
+        <w:t>hero.tsx</w:t>
+      </w:r>
+      <w:proofErr w:type="spellEnd"/>
+      <w:r>
+        <w:rPr>
+          <w:rFonts w:ascii="Times New Roman" w:hAnsi="Times New Roman" w:cs="Times New Roman"/>
+          <w:sz w:val="28"/>
+          <w:szCs w:val="28"/>
+        </w:rPr>
+        <w:t xml:space="preserve"> функция </w:t>
+      </w:r>
+      <w:proofErr w:type="spellStart"/>
+      <w:r>
+        <w:rPr>
+          <w:rFonts w:ascii="Times New Roman" w:hAnsi="Times New Roman" w:cs="Times New Roman"/>
+          <w:sz w:val="28"/>
+          <w:szCs w:val="28"/>
+        </w:rPr>
+        <w:t>handleSubmit</w:t>
+      </w:r>
+      <w:proofErr w:type="spellEnd"/>
+      <w:r>
+        <w:rPr>
+          <w:rFonts w:ascii="Times New Roman" w:hAnsi="Times New Roman" w:cs="Times New Roman"/>
+          <w:sz w:val="28"/>
+          <w:szCs w:val="28"/>
+        </w:rPr>
+        <w:t xml:space="preserve"> была переписана. Вместо имитации загрузки через </w:t>
+      </w:r>
+      <w:proofErr w:type="spellStart"/>
+      <w:r>
+        <w:rPr>
+          <w:rFonts w:ascii="Times New Roman" w:hAnsi="Times New Roman" w:cs="Times New Roman"/>
+          <w:sz w:val="28"/>
+          <w:szCs w:val="28"/>
+        </w:rPr>
+        <w:t>setInterval</w:t>
+      </w:r>
+      <w:proofErr w:type="spellEnd"/>
+      <w:r>
+        <w:rPr>
+          <w:rFonts w:ascii="Times New Roman" w:hAnsi="Times New Roman" w:cs="Times New Roman"/>
+          <w:sz w:val="28"/>
+          <w:szCs w:val="28"/>
+        </w:rPr>
+        <w:t xml:space="preserve"> теперь выполняется реальный </w:t>
+      </w:r>
+      <w:proofErr w:type="spellStart"/>
+      <w:r>
+        <w:rPr>
+          <w:rFonts w:ascii="Times New Roman" w:hAnsi="Times New Roman" w:cs="Times New Roman"/>
+          <w:sz w:val="28"/>
+          <w:szCs w:val="28"/>
+        </w:rPr>
+        <w:t>fetch</w:t>
+      </w:r>
+      <w:proofErr w:type="spellEnd"/>
+      <w:r>
+        <w:rPr>
+          <w:rFonts w:ascii="Times New Roman" w:hAnsi="Times New Roman" w:cs="Times New Roman"/>
+          <w:sz w:val="28"/>
+          <w:szCs w:val="28"/>
+        </w:rPr>
+        <w:t>-запрос к созданному маршруту POST /</w:t>
+      </w:r>
+      <w:proofErr w:type="spellStart"/>
+      <w:r>
+        <w:rPr>
+          <w:rFonts w:ascii="Times New Roman" w:hAnsi="Times New Roman" w:cs="Times New Roman"/>
+          <w:sz w:val="28"/>
+          <w:szCs w:val="28"/>
+        </w:rPr>
+        <w:t>api</w:t>
+      </w:r>
+      <w:proofErr w:type="spellEnd"/>
+      <w:r>
+        <w:rPr>
+          <w:rFonts w:ascii="Times New Roman" w:hAnsi="Times New Roman" w:cs="Times New Roman"/>
+          <w:sz w:val="28"/>
+          <w:szCs w:val="28"/>
+        </w:rPr>
+        <w:t>/</w:t>
+      </w:r>
+      <w:proofErr w:type="spellStart"/>
+      <w:r>
+        <w:rPr>
+          <w:rFonts w:ascii="Times New Roman" w:hAnsi="Times New Roman" w:cs="Times New Roman"/>
+          <w:sz w:val="28"/>
+          <w:szCs w:val="28"/>
+        </w:rPr>
+        <w:t>analyze</w:t>
+      </w:r>
+      <w:proofErr w:type="spellEnd"/>
+      <w:r>
+        <w:rPr>
+          <w:rFonts w:ascii="Times New Roman" w:hAnsi="Times New Roman" w:cs="Times New Roman"/>
+          <w:sz w:val="28"/>
+          <w:szCs w:val="28"/>
+        </w:rPr>
+        <w:t xml:space="preserve">. Добавлен новый элемент состояния </w:t>
+      </w:r>
+      <w:proofErr w:type="spellStart"/>
+      <w:r>
+        <w:rPr>
+          <w:rFonts w:ascii="Times New Roman" w:hAnsi="Times New Roman" w:cs="Times New Roman"/>
+          <w:sz w:val="28"/>
+          <w:szCs w:val="28"/>
+        </w:rPr>
+        <w:t>analysisResult</w:t>
+      </w:r>
+      <w:proofErr w:type="spellEnd"/>
+      <w:r>
+        <w:rPr>
+          <w:rFonts w:ascii="Times New Roman" w:hAnsi="Times New Roman" w:cs="Times New Roman"/>
+          <w:sz w:val="28"/>
+          <w:szCs w:val="28"/>
+        </w:rPr>
+        <w:t>, в котором сохраняется ответ сервера. Предусмотрена обработка ошибок: при недоступности репозитория или сетевом сбое пользователю выводится соответствующее сообщение. Фрагмент обновлённой функции:</w:t>
+      </w:r>
+    </w:p>
+    <w:p>
+      <w:pPr>
+        <w:spacing w:before="60" w:after="60" w:line="280" w:lineRule="auto"/>
+        <w:ind w:left="720"/>
+        <w:rPr>
+          <w:rFonts w:ascii="Courier New" w:hAnsi="Courier New" w:cs="Courier New"/>
+          <w:sz w:val="20"/>
+          <w:szCs w:val="20"/>
+        </w:rPr>
+      </w:pPr>
+      <w:proofErr w:type="spellStart"/>
+      <w:r>
+        <w:rPr>
+          <w:rFonts w:ascii="Courier New" w:hAnsi="Courier New" w:cs="Courier New"/>
+          <w:sz w:val="20"/>
+          <w:szCs w:val="20"/>
+        </w:rPr>
+        <w:t>const</w:t>
+      </w:r>
+      <w:proofErr w:type="spellEnd"/>
+      <w:r>
+        <w:rPr>
+          <w:rFonts w:ascii="Courier New" w:hAnsi="Courier New" w:cs="Courier New"/>
+          <w:sz w:val="20"/>
+          <w:szCs w:val="20"/>
+        </w:rPr>
+        <w:t xml:space="preserve"> </w:t>
+      </w:r>
+      <w:proofErr w:type="spellStart"/>
+      <w:r>
+        <w:rPr>
+          <w:rFonts w:ascii="Courier New" w:hAnsi="Courier New" w:cs="Courier New"/>
+          <w:sz w:val="20"/>
+          <w:szCs w:val="20"/>
+        </w:rPr>
+        <w:t>handleSubmit</w:t>
+      </w:r>
+      <w:proofErr w:type="spellEnd"/>
+      <w:r>
+        <w:rPr>
+          <w:rFonts w:ascii="Courier New" w:hAnsi="Courier New" w:cs="Courier New"/>
+          <w:sz w:val="20"/>
+          <w:szCs w:val="20"/>
+        </w:rPr>
+        <w:t xml:space="preserve"> = </w:t>
+      </w:r>
+      <w:proofErr w:type="spellStart"/>
+      <w:r>
+        <w:rPr>
+          <w:rFonts w:ascii="Courier New" w:hAnsi="Courier New" w:cs="Courier New"/>
+          <w:sz w:val="20"/>
+          <w:szCs w:val="20"/>
+        </w:rPr>
+        <w:t>async</w:t>
+      </w:r>
+      <w:proofErr w:type="spellEnd"/>
+      <w:r>
+        <w:rPr>
+          <w:rFonts w:ascii="Courier New" w:hAnsi="Courier New" w:cs="Courier New"/>
+          <w:sz w:val="20"/>
+          <w:szCs w:val="20"/>
+        </w:rPr>
+        <w:t xml:space="preserve"> (e: </w:t>
+      </w:r>
+      <w:proofErr w:type="spellStart"/>
+      <w:r>
+        <w:rPr>
+          <w:rFonts w:ascii="Courier New" w:hAnsi="Courier New" w:cs="Courier New"/>
+          <w:sz w:val="20"/>
+          <w:szCs w:val="20"/>
+        </w:rPr>
+        <w:t>React.FormEvent</w:t>
+      </w:r>
+      <w:proofErr w:type="spellEnd"/>
+      <w:r>
+        <w:rPr>
+          <w:rFonts w:ascii="Courier New" w:hAnsi="Courier New" w:cs="Courier New"/>
+          <w:sz w:val="20"/>
+          <w:szCs w:val="20"/>
+        </w:rPr>
+        <w:t>) =&gt; {</w:t>
+      </w:r>
+    </w:p>
+    <w:p>
+      <w:pPr>
+        <w:spacing w:before="60" w:after="60" w:line="280" w:lineRule="auto"/>
+        <w:ind w:left="720"/>
+        <w:rPr>
+          <w:rFonts w:ascii="Courier New" w:hAnsi="Courier New" w:cs="Courier New"/>
+          <w:sz w:val="20"/>
+          <w:szCs w:val="20"/>
+        </w:rPr>
+      </w:pPr>
+      <w:r>
+        <w:rPr>
+          <w:rFonts w:ascii="Courier New" w:hAnsi="Courier New" w:cs="Courier New"/>
+          <w:sz w:val="20"/>
+          <w:szCs w:val="20"/>
+        </w:rPr>
+        <w:t xml:space="preserve">  </w:t>
+      </w:r>
+      <w:proofErr w:type="spellStart"/>
+      <w:r>
+        <w:rPr>
+          <w:rFonts w:ascii="Courier New" w:hAnsi="Courier New" w:cs="Courier New"/>
+          <w:sz w:val="20"/>
+          <w:szCs w:val="20"/>
+        </w:rPr>
+        <w:t>setAnalysisResult</w:t>
+      </w:r>
+      <w:proofErr w:type="spellEnd"/>
+      <w:r>
+        <w:rPr>
+          <w:rFonts w:ascii="Courier New" w:hAnsi="Courier New" w:cs="Courier New"/>
+          <w:sz w:val="20"/>
+          <w:szCs w:val="20"/>
+        </w:rPr>
+        <w:t>(</w:t>
+      </w:r>
+      <w:proofErr w:type="spellStart"/>
+      <w:r>
+        <w:rPr>
+          <w:rFonts w:ascii="Courier New" w:hAnsi="Courier New" w:cs="Courier New"/>
+          <w:sz w:val="20"/>
+          <w:szCs w:val="20"/>
+        </w:rPr>
+        <w:t>null</w:t>
+      </w:r>
+      <w:proofErr w:type="spellEnd"/>
+      <w:r>
+        <w:rPr>
+          <w:rFonts w:ascii="Courier New" w:hAnsi="Courier New" w:cs="Courier New"/>
+          <w:sz w:val="20"/>
+          <w:szCs w:val="20"/>
+        </w:rPr>
+        <w:t>)</w:t>
+      </w:r>
+    </w:p>
+    <w:p>
+      <w:pPr>
+        <w:spacing w:before="60" w:after="60" w:line="280" w:lineRule="auto"/>
+        <w:ind w:left="720"/>
+        <w:rPr>
+          <w:rFonts w:ascii="Courier New" w:hAnsi="Courier New" w:cs="Courier New"/>
+          <w:sz w:val="20"/>
+          <w:szCs w:val="20"/>
+          <w:lang w:val="en-US"/>
+        </w:rPr>
+      </w:pPr>
+      <w:r>
+        <w:rPr>
+          <w:rFonts w:ascii="Courier New" w:hAnsi="Courier New" w:cs="Courier New"/>
+          <w:sz w:val="20"/>
+          <w:szCs w:val="20"/>
+        </w:rPr>
+        <w:t xml:space="preserve">  </w:t>
+      </w:r>
+      <w:proofErr w:type="spellStart"/>
+      <w:r>
+        <w:rPr>
+          <w:rFonts w:ascii="Courier New" w:hAnsi="Courier New" w:cs="Courier New"/>
+          <w:sz w:val="20"/>
+          <w:szCs w:val="20"/>
+          <w:lang w:val="en-US"/>
+        </w:rPr>
+        <w:t>setLoadingState</w:t>
+      </w:r>
+      <w:proofErr w:type="spellEnd"/>
+      <w:r>
+        <w:rPr>
+          <w:rFonts w:ascii="Courier New" w:hAnsi="Courier New" w:cs="Courier New"/>
+          <w:sz w:val="20"/>
+          <w:szCs w:val="20"/>
+          <w:lang w:val="en-US"/>
+        </w:rPr>
+        <w:t xml:space="preserve">({ </w:t>
+      </w:r>
+      <w:proofErr w:type="spellStart"/>
+      <w:r>
+        <w:rPr>
+          <w:rFonts w:ascii="Courier New" w:hAnsi="Courier New" w:cs="Courier New"/>
+          <w:sz w:val="20"/>
+          <w:szCs w:val="20"/>
+          <w:lang w:val="en-US"/>
+        </w:rPr>
+        <w:t>isLoading</w:t>
+      </w:r>
+      <w:proofErr w:type="spellEnd"/>
+      <w:r>
+        <w:rPr>
+          <w:rFonts w:ascii="Courier New" w:hAnsi="Courier New" w:cs="Courier New"/>
+          <w:sz w:val="20"/>
+          <w:szCs w:val="20"/>
+          <w:lang w:val="en-US"/>
+        </w:rPr>
+        <w:t>: true, progress: 50,</w:t>
+      </w:r>
+    </w:p>
+    <w:p>
+      <w:pPr>
+        <w:spacing w:before="60" w:after="60" w:line="280" w:lineRule="auto"/>
+        <w:ind w:left="720"/>
+        <w:rPr>
+          <w:rFonts w:ascii="Courier New" w:hAnsi="Courier New" w:cs="Courier New"/>
+          <w:sz w:val="20"/>
+          <w:szCs w:val="20"/>
+          <w:lang w:val="en-US"/>
+        </w:rPr>
+      </w:pPr>
+      <w:r>
+        <w:rPr>
+          <w:rFonts w:ascii="Courier New" w:hAnsi="Courier New" w:cs="Courier New"/>
+          <w:sz w:val="20"/>
+          <w:szCs w:val="20"/>
+          <w:lang w:val="en-US"/>
+        </w:rPr>
+        <w:t xml:space="preserve">                    message: 'Analyzing commits and PRs...' })</w:t>
+      </w:r>
+    </w:p>
+    <w:p>
+      <w:pPr>
+        <w:spacing w:before="60" w:after="60" w:line="280" w:lineRule="auto"/>
+        <w:ind w:left="720"/>
+        <w:rPr>
+          <w:rFonts w:ascii="Courier New" w:hAnsi="Courier New" w:cs="Courier New"/>
+          <w:sz w:val="20"/>
+          <w:szCs w:val="20"/>
+          <w:lang w:val="en-US"/>
+        </w:rPr>
+      </w:pPr>
+      <w:r>
+        <w:rPr>
+          <w:rFonts w:ascii="Courier New" w:hAnsi="Courier New" w:cs="Courier New"/>
+          <w:sz w:val="20"/>
+          <w:szCs w:val="20"/>
+          <w:lang w:val="en-US"/>
+        </w:rPr>
+        <w:t xml:space="preserve">  const res = await fetch('/</w:t>
+      </w:r>
+      <w:proofErr w:type="spellStart"/>
+      <w:r>
+        <w:rPr>
+          <w:rFonts w:ascii="Courier New" w:hAnsi="Courier New" w:cs="Courier New"/>
+          <w:sz w:val="20"/>
+          <w:szCs w:val="20"/>
+          <w:lang w:val="en-US"/>
+        </w:rPr>
+        <w:t>api</w:t>
+      </w:r>
+      <w:proofErr w:type="spellEnd"/>
+      <w:r>
+        <w:rPr>
+          <w:rFonts w:ascii="Courier New" w:hAnsi="Courier New" w:cs="Courier New"/>
+          <w:sz w:val="20"/>
+          <w:szCs w:val="20"/>
+          <w:lang w:val="en-US"/>
+        </w:rPr>
+        <w:t>/analyze', {</w:t>
+      </w:r>
+    </w:p>
+    <w:p>
+      <w:pPr>
+        <w:spacing w:before="60" w:after="60" w:line="280" w:lineRule="auto"/>
+        <w:ind w:left="720"/>
+        <w:rPr>
+          <w:rFonts w:ascii="Courier New" w:hAnsi="Courier New" w:cs="Courier New"/>
+          <w:sz w:val="20"/>
+          <w:szCs w:val="20"/>
+          <w:lang w:val="en-US"/>
+        </w:rPr>
+      </w:pPr>
+      <w:r>
+        <w:rPr>
+          <w:rFonts w:ascii="Courier New" w:hAnsi="Courier New" w:cs="Courier New"/>
+          <w:sz w:val="20"/>
+          <w:szCs w:val="20"/>
+          <w:lang w:val="en-US"/>
+        </w:rPr>
+        <w:t xml:space="preserve">    method: 'POST',</w:t>
+      </w:r>
+    </w:p>
+    <w:p>
+      <w:pPr>
+        <w:spacing w:before="60" w:after="60" w:line="280" w:lineRule="auto"/>
+        <w:ind w:left="720"/>
+        <w:rPr>
+          <w:rFonts w:ascii="Courier New" w:hAnsi="Courier New" w:cs="Courier New"/>
+          <w:sz w:val="20"/>
+          <w:szCs w:val="20"/>
+          <w:lang w:val="en-US"/>
+        </w:rPr>
+      </w:pPr>
+      <w:r>
+        <w:rPr>
+          <w:rFonts w:ascii="Courier New" w:hAnsi="Courier New" w:cs="Courier New"/>
+          <w:sz w:val="20"/>
+          <w:szCs w:val="20"/>
+          <w:lang w:val="en-US"/>
+        </w:rPr>
+        <w:t xml:space="preserve">    headers: { 'Content-Type': 'application/</w:t>
+      </w:r>
+      <w:proofErr w:type="spellStart"/>
+      <w:r>
+        <w:rPr>
+          <w:rFonts w:ascii="Courier New" w:hAnsi="Courier New" w:cs="Courier New"/>
+          <w:sz w:val="20"/>
+          <w:szCs w:val="20"/>
+          <w:lang w:val="en-US"/>
+        </w:rPr>
+        <w:t>json</w:t>
+      </w:r>
+      <w:proofErr w:type="spellEnd"/>
+      <w:r>
+        <w:rPr>
+          <w:rFonts w:ascii="Courier New" w:hAnsi="Courier New" w:cs="Courier New"/>
+          <w:sz w:val="20"/>
+          <w:szCs w:val="20"/>
+          <w:lang w:val="en-US"/>
+        </w:rPr>
+        <w:t>' },</w:t>
+      </w:r>
+    </w:p>
+    <w:p>
+      <w:pPr>
+        <w:spacing w:before="60" w:after="60" w:line="280" w:lineRule="auto"/>
+        <w:ind w:left="720"/>
+        <w:rPr>
+          <w:rFonts w:ascii="Courier New" w:hAnsi="Courier New" w:cs="Courier New"/>
+          <w:sz w:val="20"/>
+          <w:szCs w:val="20"/>
+          <w:lang w:val="en-US"/>
+        </w:rPr>
+      </w:pPr>
+      <w:r>
+        <w:rPr>
+          <w:rFonts w:ascii="Courier New" w:hAnsi="Courier New" w:cs="Courier New"/>
+          <w:sz w:val="20"/>
+          <w:szCs w:val="20"/>
+          <w:lang w:val="en-US"/>
+        </w:rPr>
+        <w:t xml:space="preserve">    body: </w:t>
+      </w:r>
+      <w:proofErr w:type="spellStart"/>
+      <w:r>
+        <w:rPr>
+          <w:rFonts w:ascii="Courier New" w:hAnsi="Courier New" w:cs="Courier New"/>
+          <w:sz w:val="20"/>
+          <w:szCs w:val="20"/>
+          <w:lang w:val="en-US"/>
+        </w:rPr>
+        <w:t>JSON.stringify</w:t>
+      </w:r>
+      <w:proofErr w:type="spellEnd"/>
+      <w:r>
+        <w:rPr>
+          <w:rFonts w:ascii="Courier New" w:hAnsi="Courier New" w:cs="Courier New"/>
+          <w:sz w:val="20"/>
+          <w:szCs w:val="20"/>
+          <w:lang w:val="en-US"/>
+        </w:rPr>
+        <w:t xml:space="preserve">({ </w:t>
+      </w:r>
+      <w:proofErr w:type="spellStart"/>
+      <w:r>
+        <w:rPr>
+          <w:rFonts w:ascii="Courier New" w:hAnsi="Courier New" w:cs="Courier New"/>
+          <w:sz w:val="20"/>
+          <w:szCs w:val="20"/>
+          <w:lang w:val="en-US"/>
+        </w:rPr>
+        <w:t>repoUrl</w:t>
+      </w:r>
+      <w:proofErr w:type="spellEnd"/>
+      <w:r>
+        <w:rPr>
+          <w:rFonts w:ascii="Courier New" w:hAnsi="Courier New" w:cs="Courier New"/>
+          <w:sz w:val="20"/>
+          <w:szCs w:val="20"/>
+          <w:lang w:val="en-US"/>
+        </w:rPr>
+        <w:t xml:space="preserve"> })</w:t>
+      </w:r>
+    </w:p>
+    <w:p>
+      <w:pPr>
+        <w:spacing w:before="60" w:after="60" w:line="280" w:lineRule="auto"/>
+        <w:ind w:left="720"/>
+        <w:rPr>
+          <w:rFonts w:ascii="Courier New" w:hAnsi="Courier New" w:cs="Courier New"/>
+          <w:sz w:val="20"/>
+          <w:szCs w:val="20"/>
+          <w:lang w:val="en-US"/>
+        </w:rPr>
+      </w:pPr>
+      <w:r>
+        <w:rPr>
+          <w:rFonts w:ascii="Courier New" w:hAnsi="Courier New" w:cs="Courier New"/>
+          <w:sz w:val="20"/>
+          <w:szCs w:val="20"/>
+          <w:lang w:val="en-US"/>
+        </w:rPr>
+        <w:t xml:space="preserve">  })</w:t>
+      </w:r>
+    </w:p>
+    <w:p>
+      <w:pPr>
+        <w:spacing w:before="60" w:after="60" w:line="280" w:lineRule="auto"/>
+        <w:ind w:left="720"/>
+        <w:rPr>
+          <w:rFonts w:ascii="Courier New" w:hAnsi="Courier New" w:cs="Courier New"/>
+          <w:sz w:val="20"/>
+          <w:szCs w:val="20"/>
+          <w:lang w:val="en-US"/>
+        </w:rPr>
+      </w:pPr>
+      <w:r>
+        <w:rPr>
+          <w:rFonts w:ascii="Courier New" w:hAnsi="Courier New" w:cs="Courier New"/>
+          <w:sz w:val="20"/>
+          <w:szCs w:val="20"/>
+          <w:lang w:val="en-US"/>
+        </w:rPr>
+        <w:t xml:space="preserve">  const data = await </w:t>
+      </w:r>
+      <w:proofErr w:type="spellStart"/>
+      <w:r>
+        <w:rPr>
+          <w:rFonts w:ascii="Courier New" w:hAnsi="Courier New" w:cs="Courier New"/>
+          <w:sz w:val="20"/>
+          <w:szCs w:val="20"/>
+          <w:lang w:val="en-US"/>
+        </w:rPr>
+        <w:t>res.json</w:t>
+      </w:r>
+      <w:proofErr w:type="spellEnd"/>
+      <w:r>
+        <w:rPr>
+          <w:rFonts w:ascii="Courier New" w:hAnsi="Courier New" w:cs="Courier New"/>
+          <w:sz w:val="20"/>
+          <w:szCs w:val="20"/>
+          <w:lang w:val="en-US"/>
+        </w:rPr>
+        <w:t>()</w:t>
+      </w:r>
+    </w:p>
+    <w:p>
+      <w:pPr>
+        <w:spacing w:before="60" w:after="60" w:line="280" w:lineRule="auto"/>
+        <w:ind w:left="720"/>
+        <w:rPr>
+          <w:rFonts w:ascii="Courier New" w:hAnsi="Courier New" w:cs="Courier New"/>
+          <w:sz w:val="20"/>
+          <w:szCs w:val="20"/>
+        </w:rPr>
+      </w:pPr>
+      <w:r>
+        <w:rPr>
+          <w:rFonts w:ascii="Courier New" w:hAnsi="Courier New" w:cs="Courier New"/>
+          <w:sz w:val="20"/>
+          <w:szCs w:val="20"/>
+          <w:lang w:val="en-US"/>
+        </w:rPr>
+        <w:t xml:space="preserve">  </w:t>
+      </w:r>
+      <w:proofErr w:type="spellStart"/>
+      <w:r>
+        <w:rPr>
+          <w:rFonts w:ascii="Courier New" w:hAnsi="Courier New" w:cs="Courier New"/>
+          <w:sz w:val="20"/>
+          <w:szCs w:val="20"/>
+        </w:rPr>
+        <w:t>setAnalysisResult</w:t>
+      </w:r>
+      <w:proofErr w:type="spellEnd"/>
+      <w:r>
+        <w:rPr>
+          <w:rFonts w:ascii="Courier New" w:hAnsi="Courier New" w:cs="Courier New"/>
+          <w:sz w:val="20"/>
+          <w:szCs w:val="20"/>
+        </w:rPr>
+        <w:t>(</w:t>
+      </w:r>
+      <w:proofErr w:type="spellStart"/>
+      <w:r>
+        <w:rPr>
+          <w:rFonts w:ascii="Courier New" w:hAnsi="Courier New" w:cs="Courier New"/>
+          <w:sz w:val="20"/>
+          <w:szCs w:val="20"/>
+        </w:rPr>
+        <w:t>data</w:t>
+      </w:r>
+      <w:proofErr w:type="spellEnd"/>
+      <w:r>
+        <w:rPr>
+          <w:rFonts w:ascii="Courier New" w:hAnsi="Courier New" w:cs="Courier New"/>
+          <w:sz w:val="20"/>
+          <w:szCs w:val="20"/>
+        </w:rPr>
+        <w:t>)  // сохраняем реальные данные</w:t>
+      </w:r>
+    </w:p>
+    <w:p>
+      <w:pPr>
+        <w:spacing w:before="60" w:after="60" w:line="280" w:lineRule="auto"/>
+        <w:ind w:left="720"/>
+        <w:rPr>
+          <w:rFonts w:ascii="Courier New" w:hAnsi="Courier New" w:cs="Courier New"/>
+          <w:sz w:val="20"/>
+          <w:szCs w:val="20"/>
+        </w:rPr>
+      </w:pPr>
+      <w:r>
+        <w:rPr>
+          <w:rFonts w:ascii="Courier New" w:hAnsi="Courier New" w:cs="Courier New"/>
+          <w:sz w:val="20"/>
+          <w:szCs w:val="20"/>
+        </w:rPr>
+        <w:t>}</w:t>
+      </w:r>
+    </w:p>
+    <w:p>
+      <w:pPr>
+        <w:spacing w:before="120" w:after="60" w:line="360" w:lineRule="auto"/>
+        <w:ind w:firstLine="709"/>
+        <w:jc w:val="both"/>
+        <w:rPr>
+          <w:rFonts w:ascii="Times New Roman" w:hAnsi="Times New Roman" w:cs="Times New Roman"/>
+          <w:b/>
+          <w:bCs/>
+          <w:sz w:val="28"/>
+          <w:szCs w:val="28"/>
+        </w:rPr>
+      </w:pPr>
+      <w:r>
+        <w:rPr>
+          <w:rFonts w:ascii="Times New Roman" w:hAnsi="Times New Roman" w:cs="Times New Roman"/>
+          <w:b/>
+          <w:bCs/>
+          <w:sz w:val="28"/>
+          <w:szCs w:val="28"/>
+        </w:rPr>
+        <w:lastRenderedPageBreak/>
+        <w:t>Шаг 4. Замена статичной карточки на динамическую</w:t>
+      </w:r>
+    </w:p>
+    <w:p>
+      <w:pPr>
+        <w:spacing w:after="0" w:line="360" w:lineRule="auto"/>
+        <w:ind w:firstLine="709"/>
+        <w:jc w:val="both"/>
+        <w:rPr>
+          <w:rFonts w:ascii="Times New Roman" w:hAnsi="Times New Roman" w:cs="Times New Roman"/>
+          <w:sz w:val="28"/>
+          <w:szCs w:val="28"/>
+        </w:rPr>
+      </w:pPr>
+      <w:r>
+        <w:rPr>
+          <w:rFonts w:ascii="Times New Roman" w:hAnsi="Times New Roman" w:cs="Times New Roman"/>
+          <w:sz w:val="28"/>
+          <w:szCs w:val="28"/>
+        </w:rPr>
+        <w:t xml:space="preserve">Декоративный блок &lt;Card&gt; в правой части главной страницы, содержавший </w:t>
+      </w:r>
+      <w:proofErr w:type="spellStart"/>
+      <w:r>
+        <w:rPr>
+          <w:rFonts w:ascii="Times New Roman" w:hAnsi="Times New Roman" w:cs="Times New Roman"/>
+          <w:sz w:val="28"/>
+          <w:szCs w:val="28"/>
+        </w:rPr>
+        <w:t>захардкоженные</w:t>
+      </w:r>
+      <w:proofErr w:type="spellEnd"/>
+      <w:r>
+        <w:rPr>
+          <w:rFonts w:ascii="Times New Roman" w:hAnsi="Times New Roman" w:cs="Times New Roman"/>
+          <w:sz w:val="28"/>
+          <w:szCs w:val="28"/>
+        </w:rPr>
+        <w:t xml:space="preserve"> строки «</w:t>
+      </w:r>
+      <w:proofErr w:type="spellStart"/>
+      <w:r>
+        <w:rPr>
+          <w:rFonts w:ascii="Times New Roman" w:hAnsi="Times New Roman" w:cs="Times New Roman"/>
+          <w:sz w:val="28"/>
+          <w:szCs w:val="28"/>
+        </w:rPr>
+        <w:t>Commits</w:t>
+      </w:r>
+      <w:proofErr w:type="spellEnd"/>
+      <w:r>
+        <w:rPr>
+          <w:rFonts w:ascii="Times New Roman" w:hAnsi="Times New Roman" w:cs="Times New Roman"/>
+          <w:sz w:val="28"/>
+          <w:szCs w:val="28"/>
+        </w:rPr>
+        <w:t>: 124», «</w:t>
+      </w:r>
+      <w:proofErr w:type="spellStart"/>
+      <w:r>
+        <w:rPr>
+          <w:rFonts w:ascii="Times New Roman" w:hAnsi="Times New Roman" w:cs="Times New Roman"/>
+          <w:sz w:val="28"/>
+          <w:szCs w:val="28"/>
+        </w:rPr>
+        <w:t>Streak</w:t>
+      </w:r>
+      <w:proofErr w:type="spellEnd"/>
+      <w:r>
+        <w:rPr>
+          <w:rFonts w:ascii="Times New Roman" w:hAnsi="Times New Roman" w:cs="Times New Roman"/>
+          <w:sz w:val="28"/>
+          <w:szCs w:val="28"/>
+        </w:rPr>
+        <w:t xml:space="preserve">: 12 </w:t>
+      </w:r>
+      <w:proofErr w:type="spellStart"/>
+      <w:r>
+        <w:rPr>
+          <w:rFonts w:ascii="Times New Roman" w:hAnsi="Times New Roman" w:cs="Times New Roman"/>
+          <w:sz w:val="28"/>
+          <w:szCs w:val="28"/>
+        </w:rPr>
+        <w:t>days</w:t>
+      </w:r>
+      <w:proofErr w:type="spellEnd"/>
+      <w:r>
+        <w:rPr>
+          <w:rFonts w:ascii="Times New Roman" w:hAnsi="Times New Roman" w:cs="Times New Roman"/>
+          <w:sz w:val="28"/>
+          <w:szCs w:val="28"/>
+        </w:rPr>
+        <w:t>» и т.д., был заменён на динамический компонент. Теперь до выполнения анализа карточка отображает подсказку «</w:t>
+      </w:r>
+      <w:proofErr w:type="spellStart"/>
+      <w:r>
+        <w:rPr>
+          <w:rFonts w:ascii="Times New Roman" w:hAnsi="Times New Roman" w:cs="Times New Roman"/>
+          <w:sz w:val="28"/>
+          <w:szCs w:val="28"/>
+        </w:rPr>
+        <w:t>Paste</w:t>
+      </w:r>
+      <w:proofErr w:type="spellEnd"/>
+      <w:r>
+        <w:rPr>
+          <w:rFonts w:ascii="Times New Roman" w:hAnsi="Times New Roman" w:cs="Times New Roman"/>
+          <w:sz w:val="28"/>
+          <w:szCs w:val="28"/>
+        </w:rPr>
+        <w:t xml:space="preserve"> a </w:t>
+      </w:r>
+      <w:proofErr w:type="spellStart"/>
+      <w:r>
+        <w:rPr>
+          <w:rFonts w:ascii="Times New Roman" w:hAnsi="Times New Roman" w:cs="Times New Roman"/>
+          <w:sz w:val="28"/>
+          <w:szCs w:val="28"/>
+        </w:rPr>
+        <w:t>repo</w:t>
+      </w:r>
+      <w:proofErr w:type="spellEnd"/>
+      <w:r>
+        <w:rPr>
+          <w:rFonts w:ascii="Times New Roman" w:hAnsi="Times New Roman" w:cs="Times New Roman"/>
+          <w:sz w:val="28"/>
+          <w:szCs w:val="28"/>
+        </w:rPr>
+        <w:t xml:space="preserve"> URL </w:t>
+      </w:r>
+      <w:proofErr w:type="spellStart"/>
+      <w:r>
+        <w:rPr>
+          <w:rFonts w:ascii="Times New Roman" w:hAnsi="Times New Roman" w:cs="Times New Roman"/>
+          <w:sz w:val="28"/>
+          <w:szCs w:val="28"/>
+        </w:rPr>
+        <w:t>and</w:t>
+      </w:r>
+      <w:proofErr w:type="spellEnd"/>
+      <w:r>
+        <w:rPr>
+          <w:rFonts w:ascii="Times New Roman" w:hAnsi="Times New Roman" w:cs="Times New Roman"/>
+          <w:sz w:val="28"/>
+          <w:szCs w:val="28"/>
+        </w:rPr>
+        <w:t xml:space="preserve"> </w:t>
+      </w:r>
+      <w:proofErr w:type="spellStart"/>
+      <w:r>
+        <w:rPr>
+          <w:rFonts w:ascii="Times New Roman" w:hAnsi="Times New Roman" w:cs="Times New Roman"/>
+          <w:sz w:val="28"/>
+          <w:szCs w:val="28"/>
+        </w:rPr>
+        <w:t>click</w:t>
+      </w:r>
+      <w:proofErr w:type="spellEnd"/>
+      <w:r>
+        <w:rPr>
+          <w:rFonts w:ascii="Times New Roman" w:hAnsi="Times New Roman" w:cs="Times New Roman"/>
+          <w:sz w:val="28"/>
+          <w:szCs w:val="28"/>
+        </w:rPr>
+        <w:t xml:space="preserve"> </w:t>
+      </w:r>
+      <w:proofErr w:type="spellStart"/>
+      <w:r>
+        <w:rPr>
+          <w:rFonts w:ascii="Times New Roman" w:hAnsi="Times New Roman" w:cs="Times New Roman"/>
+          <w:sz w:val="28"/>
+          <w:szCs w:val="28"/>
+        </w:rPr>
+        <w:t>Analyze</w:t>
+      </w:r>
+      <w:proofErr w:type="spellEnd"/>
+      <w:r>
+        <w:rPr>
+          <w:rFonts w:ascii="Times New Roman" w:hAnsi="Times New Roman" w:cs="Times New Roman"/>
+          <w:sz w:val="28"/>
+          <w:szCs w:val="28"/>
+        </w:rPr>
+        <w:t xml:space="preserve">», а после успешного получения данных — реальные метрики анализируемого репозитория: название, описание, количество коммитов, </w:t>
+      </w:r>
+      <w:proofErr w:type="spellStart"/>
+      <w:r>
+        <w:rPr>
+          <w:rFonts w:ascii="Times New Roman" w:hAnsi="Times New Roman" w:cs="Times New Roman"/>
+          <w:sz w:val="28"/>
+          <w:szCs w:val="28"/>
+        </w:rPr>
+        <w:t>streak</w:t>
+      </w:r>
+      <w:proofErr w:type="spellEnd"/>
+      <w:r>
+        <w:rPr>
+          <w:rFonts w:ascii="Times New Roman" w:hAnsi="Times New Roman" w:cs="Times New Roman"/>
+          <w:sz w:val="28"/>
+          <w:szCs w:val="28"/>
+        </w:rPr>
+        <w:t>, статистику PR и основной язык программирования.</w:t>
+      </w:r>
+    </w:p>
+    <w:p>
+      <w:pPr>
+        <w:spacing w:after="0" w:line="360" w:lineRule="auto"/>
+        <w:ind w:firstLine="709"/>
+        <w:jc w:val="both"/>
+        <w:rPr>
+          <w:rFonts w:ascii="Times New Roman" w:hAnsi="Times New Roman" w:cs="Times New Roman"/>
+          <w:sz w:val="28"/>
+          <w:szCs w:val="28"/>
+        </w:rPr>
+      </w:pPr>
+      <w:r>
+        <w:rPr>
+          <w:rFonts w:ascii="Times New Roman" w:hAnsi="Times New Roman" w:cs="Times New Roman"/>
+          <w:sz w:val="28"/>
+          <w:szCs w:val="28"/>
+        </w:rPr>
+        <w:t xml:space="preserve">В результате проведённой доработки инструмент </w:t>
+      </w:r>
+      <w:proofErr w:type="spellStart"/>
+      <w:r>
+        <w:rPr>
+          <w:rFonts w:ascii="Times New Roman" w:hAnsi="Times New Roman" w:cs="Times New Roman"/>
+          <w:sz w:val="28"/>
+          <w:szCs w:val="28"/>
+        </w:rPr>
+        <w:t>GitHub</w:t>
+      </w:r>
+      <w:proofErr w:type="spellEnd"/>
+      <w:r>
+        <w:rPr>
+          <w:rFonts w:ascii="Times New Roman" w:hAnsi="Times New Roman" w:cs="Times New Roman"/>
+          <w:sz w:val="28"/>
+          <w:szCs w:val="28"/>
+        </w:rPr>
+        <w:t xml:space="preserve"> </w:t>
+      </w:r>
+      <w:proofErr w:type="spellStart"/>
+      <w:r>
+        <w:rPr>
+          <w:rFonts w:ascii="Times New Roman" w:hAnsi="Times New Roman" w:cs="Times New Roman"/>
+          <w:sz w:val="28"/>
+          <w:szCs w:val="28"/>
+        </w:rPr>
+        <w:t>Analyzer</w:t>
+      </w:r>
+      <w:proofErr w:type="spellEnd"/>
+      <w:r>
+        <w:rPr>
+          <w:rFonts w:ascii="Times New Roman" w:hAnsi="Times New Roman" w:cs="Times New Roman"/>
+          <w:sz w:val="28"/>
+          <w:szCs w:val="28"/>
+        </w:rPr>
+        <w:t xml:space="preserve"> стал отображать реальные данные репозитория. При вводе ссылки и нажатии кнопки </w:t>
+      </w:r>
+      <w:proofErr w:type="spellStart"/>
+      <w:r>
+        <w:rPr>
+          <w:rFonts w:ascii="Times New Roman" w:hAnsi="Times New Roman" w:cs="Times New Roman"/>
+          <w:sz w:val="28"/>
+          <w:szCs w:val="28"/>
+        </w:rPr>
+        <w:t>Analyze</w:t>
+      </w:r>
+      <w:proofErr w:type="spellEnd"/>
+      <w:r>
+        <w:rPr>
+          <w:rFonts w:ascii="Times New Roman" w:hAnsi="Times New Roman" w:cs="Times New Roman"/>
+          <w:sz w:val="28"/>
+          <w:szCs w:val="28"/>
+        </w:rPr>
+        <w:t xml:space="preserve"> в карточке появляются актуальные метрики, полученные непосредственно из </w:t>
+      </w:r>
+      <w:proofErr w:type="spellStart"/>
+      <w:r>
+        <w:rPr>
+          <w:rFonts w:ascii="Times New Roman" w:hAnsi="Times New Roman" w:cs="Times New Roman"/>
+          <w:sz w:val="28"/>
+          <w:szCs w:val="28"/>
+        </w:rPr>
+        <w:t>GitHub</w:t>
+      </w:r>
+      <w:proofErr w:type="spellEnd"/>
+      <w:r>
+        <w:rPr>
+          <w:rFonts w:ascii="Times New Roman" w:hAnsi="Times New Roman" w:cs="Times New Roman"/>
+          <w:sz w:val="28"/>
+          <w:szCs w:val="28"/>
+        </w:rPr>
+        <w:t xml:space="preserve"> REST API.</w:t>
+      </w:r>
+    </w:p>
+    <w:p/>
     <w:p>
       <w:pPr>
         <w:pStyle w:val="1"/>
@@ -4561,25 +7053,7 @@
             <w:sz w:val="28"/>
             <w:szCs w:val="28"/>
           </w:rPr>
-          <w:t>собств</w:t>
-        </w:r>
-        <w:r>
-          <w:rPr>
-            <w:rStyle w:val="a7"/>
-            <w:rFonts w:ascii="Times New Roman" w:hAnsi="Times New Roman" w:cs="Times New Roman"/>
-            <w:sz w:val="28"/>
-            <w:szCs w:val="28"/>
-          </w:rPr>
-          <w:t>е</w:t>
-        </w:r>
-        <w:r>
-          <w:rPr>
-            <w:rStyle w:val="a7"/>
-            <w:rFonts w:ascii="Times New Roman" w:hAnsi="Times New Roman" w:cs="Times New Roman"/>
-            <w:sz w:val="28"/>
-            <w:szCs w:val="28"/>
-          </w:rPr>
-          <w:t>нный репозиторий</w:t>
+          <w:t>собственный репозиторий</w:t>
         </w:r>
       </w:hyperlink>
       <w:r>
@@ -4656,6 +7130,7 @@
           <w:sz w:val="28"/>
           <w:szCs w:val="28"/>
         </w:rPr>
+        <w:lastRenderedPageBreak/>
         <w:t>C — 15,5 %,</w:t>
       </w:r>
     </w:p>
@@ -4700,16 +7175,7 @@
           <w:sz w:val="28"/>
           <w:szCs w:val="28"/>
         </w:rPr>
-        <w:t xml:space="preserve">Анализ проводился на всём содержимом репозитория, включая коды и материалы из папок задач. Таким образом, в ходе работы с инструментом </w:t>
-      </w:r>
-      <w:r>
-        <w:rPr>
-          <w:rFonts w:ascii="Times New Roman" w:hAnsi="Times New Roman" w:cs="Times New Roman"/>
-          <w:sz w:val="28"/>
-          <w:szCs w:val="28"/>
-        </w:rPr>
-        <w:lastRenderedPageBreak/>
-        <w:t>GitHub Analyzer были исследованы три языка программирования — Python, C и C#.</w:t>
+        <w:t>Анализ проводился на всём содержимом репозитория, включая коды и материалы из папок задач. Таким образом, в ходе работы с инструментом GitHub Analyzer были исследованы три языка программирования — Python, C и C#.</w:t>
       </w:r>
     </w:p>
     <w:p>
@@ -4931,7 +7397,41 @@
           <w:sz w:val="28"/>
           <w:szCs w:val="28"/>
         </w:rPr>
-        <w:t>Contributions (вклад в репозиторий): 124 коммита, streak — 12 дней;</w:t>
+        <w:t xml:space="preserve">Contributions (вклад в репозиторий): 14 коммита, </w:t>
+      </w:r>
+      <w:proofErr w:type="spellStart"/>
+      <w:r>
+        <w:rPr>
+          <w:rFonts w:ascii="Times New Roman" w:hAnsi="Times New Roman" w:cs="Times New Roman"/>
+          <w:sz w:val="28"/>
+          <w:szCs w:val="28"/>
+        </w:rPr>
+        <w:t>streak</w:t>
+      </w:r>
+      <w:proofErr w:type="spellEnd"/>
+      <w:r>
+        <w:rPr>
+          <w:rFonts w:ascii="Times New Roman" w:hAnsi="Times New Roman" w:cs="Times New Roman"/>
+          <w:sz w:val="28"/>
+          <w:szCs w:val="28"/>
+        </w:rPr>
+        <w:t xml:space="preserve"> — </w:t>
+      </w:r>
+      <w:r>
+        <w:rPr>
+          <w:rFonts w:ascii="Times New Roman" w:hAnsi="Times New Roman" w:cs="Times New Roman"/>
+          <w:sz w:val="28"/>
+          <w:szCs w:val="28"/>
+        </w:rPr>
+        <w:t>0</w:t>
+      </w:r>
+      <w:r>
+        <w:rPr>
+          <w:rFonts w:ascii="Times New Roman" w:hAnsi="Times New Roman" w:cs="Times New Roman"/>
+          <w:sz w:val="28"/>
+          <w:szCs w:val="28"/>
+        </w:rPr>
+        <w:t xml:space="preserve"> дней;</w:t>
       </w:r>
     </w:p>
     <w:p>
@@ -4955,7 +7455,109 @@
           <w:sz w:val="28"/>
           <w:szCs w:val="28"/>
         </w:rPr>
-        <w:t>Pull Requests: 18 объединённых (merged), 3 открытых (open), среднее время ревью — 1,2 дня.</w:t>
+        <w:t xml:space="preserve">Pull </w:t>
+      </w:r>
+      <w:proofErr w:type="spellStart"/>
+      <w:r>
+        <w:rPr>
+          <w:rFonts w:ascii="Times New Roman" w:hAnsi="Times New Roman" w:cs="Times New Roman"/>
+          <w:sz w:val="28"/>
+          <w:szCs w:val="28"/>
+        </w:rPr>
+        <w:t>Requests</w:t>
+      </w:r>
+      <w:proofErr w:type="spellEnd"/>
+      <w:r>
+        <w:rPr>
+          <w:rFonts w:ascii="Times New Roman" w:hAnsi="Times New Roman" w:cs="Times New Roman"/>
+          <w:sz w:val="28"/>
+          <w:szCs w:val="28"/>
+        </w:rPr>
+        <w:t xml:space="preserve">: </w:t>
+      </w:r>
+      <w:r>
+        <w:rPr>
+          <w:rFonts w:ascii="Times New Roman" w:hAnsi="Times New Roman" w:cs="Times New Roman"/>
+          <w:sz w:val="28"/>
+          <w:szCs w:val="28"/>
+        </w:rPr>
+        <w:t>4</w:t>
+      </w:r>
+      <w:r>
+        <w:rPr>
+          <w:rFonts w:ascii="Times New Roman" w:hAnsi="Times New Roman" w:cs="Times New Roman"/>
+          <w:sz w:val="28"/>
+          <w:szCs w:val="28"/>
+        </w:rPr>
+        <w:t xml:space="preserve"> объединённых (</w:t>
+      </w:r>
+      <w:proofErr w:type="spellStart"/>
+      <w:r>
+        <w:rPr>
+          <w:rFonts w:ascii="Times New Roman" w:hAnsi="Times New Roman" w:cs="Times New Roman"/>
+          <w:sz w:val="28"/>
+          <w:szCs w:val="28"/>
+        </w:rPr>
+        <w:t>merged</w:t>
+      </w:r>
+      <w:proofErr w:type="spellEnd"/>
+      <w:r>
+        <w:rPr>
+          <w:rFonts w:ascii="Times New Roman" w:hAnsi="Times New Roman" w:cs="Times New Roman"/>
+          <w:sz w:val="28"/>
+          <w:szCs w:val="28"/>
+        </w:rPr>
+        <w:t xml:space="preserve">), </w:t>
+      </w:r>
+      <w:r>
+        <w:rPr>
+          <w:rFonts w:ascii="Times New Roman" w:hAnsi="Times New Roman" w:cs="Times New Roman"/>
+          <w:sz w:val="28"/>
+          <w:szCs w:val="28"/>
+        </w:rPr>
+        <w:t>2</w:t>
+      </w:r>
+      <w:r>
+        <w:rPr>
+          <w:rFonts w:ascii="Times New Roman" w:hAnsi="Times New Roman" w:cs="Times New Roman"/>
+          <w:sz w:val="28"/>
+          <w:szCs w:val="28"/>
+        </w:rPr>
+        <w:t xml:space="preserve"> открытых (</w:t>
+      </w:r>
+      <w:proofErr w:type="spellStart"/>
+      <w:r>
+        <w:rPr>
+          <w:rFonts w:ascii="Times New Roman" w:hAnsi="Times New Roman" w:cs="Times New Roman"/>
+          <w:sz w:val="28"/>
+          <w:szCs w:val="28"/>
+        </w:rPr>
+        <w:t>open</w:t>
+      </w:r>
+      <w:proofErr w:type="spellEnd"/>
+      <w:r>
+        <w:rPr>
+          <w:rFonts w:ascii="Times New Roman" w:hAnsi="Times New Roman" w:cs="Times New Roman"/>
+          <w:sz w:val="28"/>
+          <w:szCs w:val="28"/>
+        </w:rPr>
+        <w:t xml:space="preserve">), среднее время ревью — </w:t>
+      </w:r>
+      <w:r>
+        <w:rPr>
+          <w:rFonts w:ascii="Times New Roman" w:hAnsi="Times New Roman" w:cs="Times New Roman"/>
+          <w:sz w:val="28"/>
+          <w:szCs w:val="28"/>
+        </w:rPr>
+        <w:t>22</w:t>
+      </w:r>
+      <w:r>
+        <w:rPr>
+          <w:rFonts w:ascii="Times New Roman" w:hAnsi="Times New Roman" w:cs="Times New Roman"/>
+          <w:sz w:val="28"/>
+          <w:szCs w:val="28"/>
+        </w:rPr>
+        <w:t>,2 дня.</w:t>
       </w:r>
     </w:p>
     <w:p>
@@ -4967,7 +7569,6 @@
           <w:rFonts w:ascii="Times New Roman" w:hAnsi="Times New Roman" w:cs="Times New Roman"/>
           <w:sz w:val="28"/>
           <w:szCs w:val="28"/>
-          <w:lang w:val="en-US"/>
         </w:rPr>
       </w:pPr>
       <w:r>
@@ -4988,7 +7589,6 @@
           <w:rFonts w:ascii="Times New Roman" w:hAnsi="Times New Roman" w:cs="Times New Roman"/>
           <w:sz w:val="28"/>
           <w:szCs w:val="28"/>
-          <w:lang w:val="en-US"/>
         </w:rPr>
       </w:pPr>
     </w:p>
@@ -5001,15 +7601,15 @@
       <w:r>
         <w:rPr>
           <w:rFonts w:ascii="Times New Roman" w:hAnsi="Times New Roman" w:cs="Times New Roman"/>
-          <w:sz w:val="28"/>
-          <w:szCs w:val="28"/>
-          <w:lang w:val="en-US"/>
-        </w:rPr>
-        <w:lastRenderedPageBreak/>
+          <w:noProof/>
+          <w:sz w:val="28"/>
+          <w:szCs w:val="28"/>
+          <w:lang w:val="en-US"/>
+        </w:rPr>
         <w:drawing>
-          <wp:inline distT="0" distB="0" distL="0" distR="0" wp14:anchorId="240F6902" wp14:editId="748F6A3C">
-            <wp:extent cx="5940425" cy="1970405"/>
-            <wp:effectExtent l="0" t="0" r="3175" b="0"/>
+          <wp:inline distT="0" distB="0" distL="0" distR="0" wp14:anchorId="240F6902" wp14:editId="7169B603">
+            <wp:extent cx="5687660" cy="1970405"/>
+            <wp:effectExtent l="0" t="0" r="8890" b="0"/>
             <wp:docPr id="1472251495" name="Рисунок 1"/>
             <wp:cNvGraphicFramePr>
               <a:graphicFrameLocks xmlns:a="http://schemas.openxmlformats.org/drawingml/2006/main" noChangeAspect="1"/>
@@ -5018,11 +7618,17 @@
               <a:graphicData uri="http://schemas.openxmlformats.org/drawingml/2006/picture">
                 <pic:pic xmlns:pic="http://schemas.openxmlformats.org/drawingml/2006/picture">
                   <pic:nvPicPr>
-                    <pic:cNvPr id="1472251495" name=""/>
+                    <pic:cNvPr id="1472251495" name="Рисунок 1"/>
                     <pic:cNvPicPr/>
                   </pic:nvPicPr>
                   <pic:blipFill>
-                    <a:blip r:embed="rId20"/>
+                    <a:blip r:embed="rId20">
+                      <a:extLst>
+                        <a:ext uri="{28A0092B-C50C-407E-A947-70E740481C1C}">
+                          <a14:useLocalDpi xmlns:a14="http://schemas.microsoft.com/office/drawing/2010/main" val="0"/>
+                        </a:ext>
+                      </a:extLst>
+                    </a:blip>
                     <a:stretch>
                       <a:fillRect/>
                     </a:stretch>
@@ -5030,7 +7636,7 @@
                   <pic:spPr>
                     <a:xfrm>
                       <a:off x="0" y="0"/>
-                      <a:ext cx="5940425" cy="1970405"/>
+                      <a:ext cx="5687660" cy="1970405"/>
                     </a:xfrm>
                     <a:prstGeom prst="rect">
                       <a:avLst/>
@@ -5360,6 +7966,7 @@
           <w:rFonts w:ascii="Times New Roman" w:hAnsi="Times New Roman" w:cs="Times New Roman"/>
           <w:sz w:val="28"/>
           <w:szCs w:val="28"/>
+          <w:lang w:val="en-US"/>
         </w:rPr>
       </w:pPr>
       <w:r>
@@ -5376,6 +7983,7 @@
           <w:rFonts w:ascii="Times New Roman" w:hAnsi="Times New Roman" w:cs="Times New Roman"/>
           <w:sz w:val="28"/>
           <w:szCs w:val="28"/>
+          <w:lang w:val="en-US"/>
         </w:rPr>
         <w:t xml:space="preserve">: </w:t>
       </w:r>
@@ -5393,6 +8001,7 @@
           <w:rFonts w:ascii="Times New Roman" w:hAnsi="Times New Roman" w:cs="Times New Roman"/>
           <w:sz w:val="28"/>
           <w:szCs w:val="28"/>
+          <w:lang w:val="en-US"/>
         </w:rPr>
         <w:t>://</w:t>
       </w:r>
@@ -5410,6 +8019,7 @@
           <w:rFonts w:ascii="Times New Roman" w:hAnsi="Times New Roman" w:cs="Times New Roman"/>
           <w:sz w:val="28"/>
           <w:szCs w:val="28"/>
+          <w:lang w:val="en-US"/>
         </w:rPr>
         <w:t>.</w:t>
       </w:r>
@@ -5427,6 +8037,7 @@
           <w:rFonts w:ascii="Times New Roman" w:hAnsi="Times New Roman" w:cs="Times New Roman"/>
           <w:sz w:val="28"/>
           <w:szCs w:val="28"/>
+          <w:lang w:val="en-US"/>
         </w:rPr>
         <w:t>/</w:t>
       </w:r>
@@ -5444,6 +8055,7 @@
           <w:rFonts w:ascii="Times New Roman" w:hAnsi="Times New Roman" w:cs="Times New Roman"/>
           <w:sz w:val="28"/>
           <w:szCs w:val="28"/>
+          <w:lang w:val="en-US"/>
         </w:rPr>
         <w:t>/</w:t>
       </w:r>
@@ -5461,6 +8073,7 @@
           <w:rFonts w:ascii="Times New Roman" w:hAnsi="Times New Roman" w:cs="Times New Roman"/>
           <w:sz w:val="28"/>
           <w:szCs w:val="28"/>
+          <w:lang w:val="en-US"/>
         </w:rPr>
         <w:t>-</w:t>
       </w:r>
@@ -5478,6 +8091,7 @@
           <w:rFonts w:ascii="Times New Roman" w:hAnsi="Times New Roman" w:cs="Times New Roman"/>
           <w:sz w:val="28"/>
           <w:szCs w:val="28"/>
+          <w:lang w:val="en-US"/>
         </w:rPr>
         <w:t>.</w:t>
       </w:r>
@@ -7057,6 +9671,7 @@
   <w:style w:type="character" w:default="1" w:styleId="a0">
     <w:name w:val="Default Paragraph Font"/>
     <w:uiPriority w:val="1"/>
+    <w:semiHidden/>
     <w:unhideWhenUsed/>
   </w:style>
   <w:style w:type="table" w:default="1" w:styleId="a1">

</xml_diff>